<commit_message>
IQRA Kids, iteration 5: the author's review, the spoken lines, the makhraj prompt
Seven decisions after seeing the first drafts on screen, recorded before the
build: the door at the top of the home page; kids lessons at #/kids/lesson/N so
the breadcrumb goes back to the kids menu and the route switches the skin; a
song as a succession of shape-family cards driven by the active letter the
engine already reports, never a line; the letter card as picture, big bare
letter, four small cards; no makhraj badges on a letter card; two spoken
recordings per letter in the teacher's voice; Manara points and never speaks.

The sheet gains a seventh table: 70 spoken lines, an English intro and a forms
line for each of the 35 rows. The slot cell names the file the way lesson 6's
"<word> وقف" does — ب مقدمة, ب حركات — so nothing is typed.

Co-Authored-By: Claude Fable 5.1 <noreply@anthropic.com>
</commit_message>
<xml_diff>
--- a/Word Tables/الحروف الهجائية.docx
+++ b/Word Tables/الحروف الهجائية.docx
@@ -11775,6 +11775,3849 @@
                 <w:szCs w:val="18"/>
               </w:rPr>
               <w:t xml:space="preserve">Tongue اللسان</w:t>
+            </w:r>
+          </w:p>
+        </w:tc>
+      </w:tr>
+    </w:tbl>
+    <w:p>
+      <w:pPr>
+        <w:pStyle w:val="Heading2"/>
+        <w:spacing w:after="120" w:before="320"/>
+      </w:pPr>
+      <w:r>
+        <w:t xml:space="preserve">Spoken lines — an intro and a forms line for every letter</w:t>
+      </w:r>
+    </w:p>
+    <w:p>
+      <w:pPr>
+        <w:spacing w:after="160"/>
+      </w:pPr>
+      <w:r>
+        <w:rPr>
+          <w:i/>
+          <w:iCs/>
+          <w:color w:val="555555"/>
+          <w:sz w:val="18"/>
+          <w:szCs w:val="18"/>
+        </w:rPr>
+        <w:t xml:space="preserve">Two recordings per row of lessons 1–3, in the teacher’s own voice. The intro is English; Manāra points at the picture and the letter while it plays, and never speaks. The forms line is recorded WHOLE and played whole — its Arabic lights up as each form is said, from boundaries tapped in the calibration page. The Slot cell is what the intake tool names the file from, the same way lesson 6 uses «&lt;word&gt; وقف».</w:t>
+      </w:r>
+    </w:p>
+    <w:tbl>
+      <w:tblPr>
+        <w:tblW w:type="dxa" w:w="12960"/>
+        <w:tblBorders>
+          <w:top w:val="single" w:color="auto" w:sz="4"/>
+          <w:left w:val="single" w:color="auto" w:sz="4"/>
+          <w:bottom w:val="single" w:color="auto" w:sz="4"/>
+          <w:right w:val="single" w:color="auto" w:sz="4"/>
+          <w:insideH w:val="single" w:color="auto" w:sz="4"/>
+          <w:insideV w:val="single" w:color="auto" w:sz="4"/>
+        </w:tblBorders>
+      </w:tblPr>
+      <w:tblGrid>
+        <w:gridCol w:w="1900"/>
+        <w:gridCol w:w="8060"/>
+        <w:gridCol w:w="3000"/>
+      </w:tblGrid>
+      <w:tr>
+        <w:trPr>
+          <w:tblHeader/>
+        </w:trPr>
+        <w:tc>
+          <w:tcPr>
+            <w:tcW w:type="dxa" w:w="1900"/>
+            <w:shd w:fill="E8EFE9" w:val="clear"/>
+          </w:tcPr>
+          <w:p>
+            <w:r>
+              <w:rPr>
+                <w:b/>
+                <w:bCs/>
+                <w:sz w:val="18"/>
+                <w:szCs w:val="18"/>
+              </w:rPr>
+              <w:t xml:space="preserve">Slot (names the file)</w:t>
+            </w:r>
+          </w:p>
+        </w:tc>
+        <w:tc>
+          <w:tcPr>
+            <w:tcW w:type="dxa" w:w="8060"/>
+            <w:shd w:fill="E8EFE9" w:val="clear"/>
+          </w:tcPr>
+          <w:p>
+            <w:r>
+              <w:rPr>
+                <w:b/>
+                <w:bCs/>
+                <w:sz w:val="18"/>
+                <w:szCs w:val="18"/>
+              </w:rPr>
+              <w:t xml:space="preserve">What to say</w:t>
+            </w:r>
+          </w:p>
+        </w:tc>
+        <w:tc>
+          <w:tcPr>
+            <w:tcW w:type="dxa" w:w="3000"/>
+            <w:shd w:fill="E8EFE9" w:val="clear"/>
+          </w:tcPr>
+          <w:p>
+            <w:r>
+              <w:rPr>
+                <w:b/>
+                <w:bCs/>
+                <w:sz w:val="18"/>
+                <w:szCs w:val="18"/>
+              </w:rPr>
+              <w:t xml:space="preserve">Lights up as you say it</w:t>
+            </w:r>
+          </w:p>
+        </w:tc>
+      </w:tr>
+      <w:tr>
+        <w:tc>
+          <w:tcPr>
+            <w:tcW w:type="dxa" w:w="1900"/>
+          </w:tcPr>
+          <w:p>
+            <w:pPr>
+              <w:bidi/>
+              <w:jc w:val="center"/>
+            </w:pPr>
+            <w:r>
+              <w:rPr>
+                <w:rFonts w:ascii="KFGQPC HAFS Uthmanic Script" w:cs="KFGQPC HAFS Uthmanic Script" w:eastAsia="KFGQPC HAFS Uthmanic Script" w:hAnsi="KFGQPC HAFS Uthmanic Script"/>
+                <w:sz w:val="32"/>
+                <w:szCs w:val="32"/>
+                <w:rtl/>
+              </w:rPr>
+              <w:t xml:space="preserve">ب مقدمة</w:t>
+            </w:r>
+          </w:p>
+        </w:tc>
+        <w:tc>
+          <w:tcPr>
+            <w:tcW w:type="dxa" w:w="8060"/>
+          </w:tcPr>
+          <w:p>
+            <w:r>
+              <w:rPr>
+                <w:b w:val="false"/>
+                <w:bCs w:val="false"/>
+                <w:sz w:val="18"/>
+                <w:szCs w:val="18"/>
+              </w:rPr>
+              <w:t xml:space="preserve">This is the letter baa. It looks like a boat. Look — one bubble under it. Baa has one dot under it.</w:t>
+            </w:r>
+          </w:p>
+        </w:tc>
+        <w:tc>
+          <w:tcPr>
+            <w:tcW w:type="dxa" w:w="3000"/>
+          </w:tcPr>
+          <w:p>
+            <w:pPr>
+              <w:bidi/>
+              <w:jc w:val="center"/>
+            </w:pPr>
+          </w:p>
+        </w:tc>
+      </w:tr>
+      <w:tr>
+        <w:tc>
+          <w:tcPr>
+            <w:tcW w:type="dxa" w:w="1900"/>
+          </w:tcPr>
+          <w:p>
+            <w:pPr>
+              <w:bidi/>
+              <w:jc w:val="center"/>
+            </w:pPr>
+            <w:r>
+              <w:rPr>
+                <w:rFonts w:ascii="KFGQPC HAFS Uthmanic Script" w:cs="KFGQPC HAFS Uthmanic Script" w:eastAsia="KFGQPC HAFS Uthmanic Script" w:hAnsi="KFGQPC HAFS Uthmanic Script"/>
+                <w:sz w:val="32"/>
+                <w:szCs w:val="32"/>
+                <w:rtl/>
+              </w:rPr>
+              <w:t xml:space="preserve">ب حركات</w:t>
+            </w:r>
+          </w:p>
+        </w:tc>
+        <w:tc>
+          <w:tcPr>
+            <w:tcW w:type="dxa" w:w="8060"/>
+          </w:tcPr>
+          <w:p>
+            <w:r>
+              <w:rPr>
+                <w:b w:val="false"/>
+                <w:bCs w:val="false"/>
+                <w:sz w:val="18"/>
+                <w:szCs w:val="18"/>
+              </w:rPr>
+              <w:t xml:space="preserve">With a fatha it's بَ. With a damma it's بُ. With a kasra it's بِ. And with a sukoon after نَ, it's نَبۡ.</w:t>
+            </w:r>
+          </w:p>
+        </w:tc>
+        <w:tc>
+          <w:tcPr>
+            <w:tcW w:type="dxa" w:w="3000"/>
+          </w:tcPr>
+          <w:p>
+            <w:pPr>
+              <w:bidi/>
+              <w:jc w:val="center"/>
+            </w:pPr>
+            <w:r>
+              <w:rPr>
+                <w:rFonts w:ascii="KFGQPC HAFS Uthmanic Script" w:cs="KFGQPC HAFS Uthmanic Script" w:eastAsia="KFGQPC HAFS Uthmanic Script" w:hAnsi="KFGQPC HAFS Uthmanic Script"/>
+                <w:sz w:val="32"/>
+                <w:szCs w:val="32"/>
+                <w:rtl/>
+              </w:rPr>
+              <w:t xml:space="preserve">بَ بُ بِ نَبۡ</w:t>
+            </w:r>
+          </w:p>
+        </w:tc>
+      </w:tr>
+      <w:tr>
+        <w:tc>
+          <w:tcPr>
+            <w:tcW w:type="dxa" w:w="1900"/>
+          </w:tcPr>
+          <w:p>
+            <w:pPr>
+              <w:bidi/>
+              <w:jc w:val="center"/>
+            </w:pPr>
+            <w:r>
+              <w:rPr>
+                <w:rFonts w:ascii="KFGQPC HAFS Uthmanic Script" w:cs="KFGQPC HAFS Uthmanic Script" w:eastAsia="KFGQPC HAFS Uthmanic Script" w:hAnsi="KFGQPC HAFS Uthmanic Script"/>
+                <w:sz w:val="32"/>
+                <w:szCs w:val="32"/>
+                <w:rtl/>
+              </w:rPr>
+              <w:t xml:space="preserve">ت مقدمة</w:t>
+            </w:r>
+          </w:p>
+        </w:tc>
+        <w:tc>
+          <w:tcPr>
+            <w:tcW w:type="dxa" w:w="8060"/>
+          </w:tcPr>
+          <w:p>
+            <w:r>
+              <w:rPr>
+                <w:b w:val="false"/>
+                <w:bCs w:val="false"/>
+                <w:sz w:val="18"/>
+                <w:szCs w:val="18"/>
+              </w:rPr>
+              <w:t xml:space="preserve">This is the letter taa. It looks like the same boat. Look — two bubbles on top. Taa has two dots on top.</w:t>
+            </w:r>
+          </w:p>
+        </w:tc>
+        <w:tc>
+          <w:tcPr>
+            <w:tcW w:type="dxa" w:w="3000"/>
+          </w:tcPr>
+          <w:p>
+            <w:pPr>
+              <w:bidi/>
+              <w:jc w:val="center"/>
+            </w:pPr>
+          </w:p>
+        </w:tc>
+      </w:tr>
+      <w:tr>
+        <w:tc>
+          <w:tcPr>
+            <w:tcW w:type="dxa" w:w="1900"/>
+          </w:tcPr>
+          <w:p>
+            <w:pPr>
+              <w:bidi/>
+              <w:jc w:val="center"/>
+            </w:pPr>
+            <w:r>
+              <w:rPr>
+                <w:rFonts w:ascii="KFGQPC HAFS Uthmanic Script" w:cs="KFGQPC HAFS Uthmanic Script" w:eastAsia="KFGQPC HAFS Uthmanic Script" w:hAnsi="KFGQPC HAFS Uthmanic Script"/>
+                <w:sz w:val="32"/>
+                <w:szCs w:val="32"/>
+                <w:rtl/>
+              </w:rPr>
+              <w:t xml:space="preserve">ت حركات</w:t>
+            </w:r>
+          </w:p>
+        </w:tc>
+        <w:tc>
+          <w:tcPr>
+            <w:tcW w:type="dxa" w:w="8060"/>
+          </w:tcPr>
+          <w:p>
+            <w:r>
+              <w:rPr>
+                <w:b w:val="false"/>
+                <w:bCs w:val="false"/>
+                <w:sz w:val="18"/>
+                <w:szCs w:val="18"/>
+              </w:rPr>
+              <w:t xml:space="preserve">With a fatha it's تَ. With a damma it's تُ. With a kasra it's تِ. And with a sukoon after نَ, it's نَتۡ.</w:t>
+            </w:r>
+          </w:p>
+        </w:tc>
+        <w:tc>
+          <w:tcPr>
+            <w:tcW w:type="dxa" w:w="3000"/>
+          </w:tcPr>
+          <w:p>
+            <w:pPr>
+              <w:bidi/>
+              <w:jc w:val="center"/>
+            </w:pPr>
+            <w:r>
+              <w:rPr>
+                <w:rFonts w:ascii="KFGQPC HAFS Uthmanic Script" w:cs="KFGQPC HAFS Uthmanic Script" w:eastAsia="KFGQPC HAFS Uthmanic Script" w:hAnsi="KFGQPC HAFS Uthmanic Script"/>
+                <w:sz w:val="32"/>
+                <w:szCs w:val="32"/>
+                <w:rtl/>
+              </w:rPr>
+              <w:t xml:space="preserve">تَ تُ تِ نَتۡ</w:t>
+            </w:r>
+          </w:p>
+        </w:tc>
+      </w:tr>
+      <w:tr>
+        <w:tc>
+          <w:tcPr>
+            <w:tcW w:type="dxa" w:w="1900"/>
+          </w:tcPr>
+          <w:p>
+            <w:pPr>
+              <w:bidi/>
+              <w:jc w:val="center"/>
+            </w:pPr>
+            <w:r>
+              <w:rPr>
+                <w:rFonts w:ascii="KFGQPC HAFS Uthmanic Script" w:cs="KFGQPC HAFS Uthmanic Script" w:eastAsia="KFGQPC HAFS Uthmanic Script" w:hAnsi="KFGQPC HAFS Uthmanic Script"/>
+                <w:sz w:val="32"/>
+                <w:szCs w:val="32"/>
+                <w:rtl/>
+              </w:rPr>
+              <w:t xml:space="preserve">ث مقدمة</w:t>
+            </w:r>
+          </w:p>
+        </w:tc>
+        <w:tc>
+          <w:tcPr>
+            <w:tcW w:type="dxa" w:w="8060"/>
+          </w:tcPr>
+          <w:p>
+            <w:r>
+              <w:rPr>
+                <w:b w:val="false"/>
+                <w:bCs w:val="false"/>
+                <w:sz w:val="18"/>
+                <w:szCs w:val="18"/>
+              </w:rPr>
+              <w:t xml:space="preserve">This is the letter thaa. It looks like the same boat. Look — three bubbles on top. Thaa has three dots on top.</w:t>
+            </w:r>
+          </w:p>
+        </w:tc>
+        <w:tc>
+          <w:tcPr>
+            <w:tcW w:type="dxa" w:w="3000"/>
+          </w:tcPr>
+          <w:p>
+            <w:pPr>
+              <w:bidi/>
+              <w:jc w:val="center"/>
+            </w:pPr>
+          </w:p>
+        </w:tc>
+      </w:tr>
+      <w:tr>
+        <w:tc>
+          <w:tcPr>
+            <w:tcW w:type="dxa" w:w="1900"/>
+          </w:tcPr>
+          <w:p>
+            <w:pPr>
+              <w:bidi/>
+              <w:jc w:val="center"/>
+            </w:pPr>
+            <w:r>
+              <w:rPr>
+                <w:rFonts w:ascii="KFGQPC HAFS Uthmanic Script" w:cs="KFGQPC HAFS Uthmanic Script" w:eastAsia="KFGQPC HAFS Uthmanic Script" w:hAnsi="KFGQPC HAFS Uthmanic Script"/>
+                <w:sz w:val="32"/>
+                <w:szCs w:val="32"/>
+                <w:rtl/>
+              </w:rPr>
+              <w:t xml:space="preserve">ث حركات</w:t>
+            </w:r>
+          </w:p>
+        </w:tc>
+        <w:tc>
+          <w:tcPr>
+            <w:tcW w:type="dxa" w:w="8060"/>
+          </w:tcPr>
+          <w:p>
+            <w:r>
+              <w:rPr>
+                <w:b w:val="false"/>
+                <w:bCs w:val="false"/>
+                <w:sz w:val="18"/>
+                <w:szCs w:val="18"/>
+              </w:rPr>
+              <w:t xml:space="preserve">With a fatha it's ثَ. With a damma it's ثُ. With a kasra it's ثِ. And with a sukoon after نَ, it's نَثۡ.</w:t>
+            </w:r>
+          </w:p>
+        </w:tc>
+        <w:tc>
+          <w:tcPr>
+            <w:tcW w:type="dxa" w:w="3000"/>
+          </w:tcPr>
+          <w:p>
+            <w:pPr>
+              <w:bidi/>
+              <w:jc w:val="center"/>
+            </w:pPr>
+            <w:r>
+              <w:rPr>
+                <w:rFonts w:ascii="KFGQPC HAFS Uthmanic Script" w:cs="KFGQPC HAFS Uthmanic Script" w:eastAsia="KFGQPC HAFS Uthmanic Script" w:hAnsi="KFGQPC HAFS Uthmanic Script"/>
+                <w:sz w:val="32"/>
+                <w:szCs w:val="32"/>
+                <w:rtl/>
+              </w:rPr>
+              <w:t xml:space="preserve">ثَ ثُ ثِ نَثۡ</w:t>
+            </w:r>
+          </w:p>
+        </w:tc>
+      </w:tr>
+      <w:tr>
+        <w:tc>
+          <w:tcPr>
+            <w:tcW w:type="dxa" w:w="1900"/>
+          </w:tcPr>
+          <w:p>
+            <w:pPr>
+              <w:bidi/>
+              <w:jc w:val="center"/>
+            </w:pPr>
+            <w:r>
+              <w:rPr>
+                <w:rFonts w:ascii="KFGQPC HAFS Uthmanic Script" w:cs="KFGQPC HAFS Uthmanic Script" w:eastAsia="KFGQPC HAFS Uthmanic Script" w:hAnsi="KFGQPC HAFS Uthmanic Script"/>
+                <w:sz w:val="32"/>
+                <w:szCs w:val="32"/>
+                <w:rtl/>
+              </w:rPr>
+              <w:t xml:space="preserve">ج مقدمة</w:t>
+            </w:r>
+          </w:p>
+        </w:tc>
+        <w:tc>
+          <w:tcPr>
+            <w:tcW w:type="dxa" w:w="8060"/>
+          </w:tcPr>
+          <w:p>
+            <w:r>
+              <w:rPr>
+                <w:b w:val="false"/>
+                <w:bCs w:val="false"/>
+                <w:sz w:val="18"/>
+                <w:szCs w:val="18"/>
+              </w:rPr>
+              <w:t xml:space="preserve">This is the letter jeem. It looks like a crescent moon lying on its back. Look — one bubble inside it. Jeem has one dot under it.</w:t>
+            </w:r>
+          </w:p>
+        </w:tc>
+        <w:tc>
+          <w:tcPr>
+            <w:tcW w:type="dxa" w:w="3000"/>
+          </w:tcPr>
+          <w:p>
+            <w:pPr>
+              <w:bidi/>
+              <w:jc w:val="center"/>
+            </w:pPr>
+          </w:p>
+        </w:tc>
+      </w:tr>
+      <w:tr>
+        <w:tc>
+          <w:tcPr>
+            <w:tcW w:type="dxa" w:w="1900"/>
+          </w:tcPr>
+          <w:p>
+            <w:pPr>
+              <w:bidi/>
+              <w:jc w:val="center"/>
+            </w:pPr>
+            <w:r>
+              <w:rPr>
+                <w:rFonts w:ascii="KFGQPC HAFS Uthmanic Script" w:cs="KFGQPC HAFS Uthmanic Script" w:eastAsia="KFGQPC HAFS Uthmanic Script" w:hAnsi="KFGQPC HAFS Uthmanic Script"/>
+                <w:sz w:val="32"/>
+                <w:szCs w:val="32"/>
+                <w:rtl/>
+              </w:rPr>
+              <w:t xml:space="preserve">ج حركات</w:t>
+            </w:r>
+          </w:p>
+        </w:tc>
+        <w:tc>
+          <w:tcPr>
+            <w:tcW w:type="dxa" w:w="8060"/>
+          </w:tcPr>
+          <w:p>
+            <w:r>
+              <w:rPr>
+                <w:b w:val="false"/>
+                <w:bCs w:val="false"/>
+                <w:sz w:val="18"/>
+                <w:szCs w:val="18"/>
+              </w:rPr>
+              <w:t xml:space="preserve">With a fatha it's جَ. With a damma it's جُ. With a kasra it's جِ. And with a sukoon after نَ, it's نَجۡ.</w:t>
+            </w:r>
+          </w:p>
+        </w:tc>
+        <w:tc>
+          <w:tcPr>
+            <w:tcW w:type="dxa" w:w="3000"/>
+          </w:tcPr>
+          <w:p>
+            <w:pPr>
+              <w:bidi/>
+              <w:jc w:val="center"/>
+            </w:pPr>
+            <w:r>
+              <w:rPr>
+                <w:rFonts w:ascii="KFGQPC HAFS Uthmanic Script" w:cs="KFGQPC HAFS Uthmanic Script" w:eastAsia="KFGQPC HAFS Uthmanic Script" w:hAnsi="KFGQPC HAFS Uthmanic Script"/>
+                <w:sz w:val="32"/>
+                <w:szCs w:val="32"/>
+                <w:rtl/>
+              </w:rPr>
+              <w:t xml:space="preserve">جَ جُ جِ نَجۡ</w:t>
+            </w:r>
+          </w:p>
+        </w:tc>
+      </w:tr>
+      <w:tr>
+        <w:tc>
+          <w:tcPr>
+            <w:tcW w:type="dxa" w:w="1900"/>
+          </w:tcPr>
+          <w:p>
+            <w:pPr>
+              <w:bidi/>
+              <w:jc w:val="center"/>
+            </w:pPr>
+            <w:r>
+              <w:rPr>
+                <w:rFonts w:ascii="KFGQPC HAFS Uthmanic Script" w:cs="KFGQPC HAFS Uthmanic Script" w:eastAsia="KFGQPC HAFS Uthmanic Script" w:hAnsi="KFGQPC HAFS Uthmanic Script"/>
+                <w:sz w:val="32"/>
+                <w:szCs w:val="32"/>
+                <w:rtl/>
+              </w:rPr>
+              <w:t xml:space="preserve">ح مقدمة</w:t>
+            </w:r>
+          </w:p>
+        </w:tc>
+        <w:tc>
+          <w:tcPr>
+            <w:tcW w:type="dxa" w:w="8060"/>
+          </w:tcPr>
+          <w:p>
+            <w:r>
+              <w:rPr>
+                <w:b w:val="false"/>
+                <w:bCs w:val="false"/>
+                <w:sz w:val="18"/>
+                <w:szCs w:val="18"/>
+              </w:rPr>
+              <w:t xml:space="preserve">This is the letter ḥaa. It looks like the same crescent moon. Look — no bubbles at all. Ḥaa has no dots.</w:t>
+            </w:r>
+          </w:p>
+        </w:tc>
+        <w:tc>
+          <w:tcPr>
+            <w:tcW w:type="dxa" w:w="3000"/>
+          </w:tcPr>
+          <w:p>
+            <w:pPr>
+              <w:bidi/>
+              <w:jc w:val="center"/>
+            </w:pPr>
+          </w:p>
+        </w:tc>
+      </w:tr>
+      <w:tr>
+        <w:tc>
+          <w:tcPr>
+            <w:tcW w:type="dxa" w:w="1900"/>
+          </w:tcPr>
+          <w:p>
+            <w:pPr>
+              <w:bidi/>
+              <w:jc w:val="center"/>
+            </w:pPr>
+            <w:r>
+              <w:rPr>
+                <w:rFonts w:ascii="KFGQPC HAFS Uthmanic Script" w:cs="KFGQPC HAFS Uthmanic Script" w:eastAsia="KFGQPC HAFS Uthmanic Script" w:hAnsi="KFGQPC HAFS Uthmanic Script"/>
+                <w:sz w:val="32"/>
+                <w:szCs w:val="32"/>
+                <w:rtl/>
+              </w:rPr>
+              <w:t xml:space="preserve">ح حركات</w:t>
+            </w:r>
+          </w:p>
+        </w:tc>
+        <w:tc>
+          <w:tcPr>
+            <w:tcW w:type="dxa" w:w="8060"/>
+          </w:tcPr>
+          <w:p>
+            <w:r>
+              <w:rPr>
+                <w:b w:val="false"/>
+                <w:bCs w:val="false"/>
+                <w:sz w:val="18"/>
+                <w:szCs w:val="18"/>
+              </w:rPr>
+              <w:t xml:space="preserve">With a fatha it's حَ. With a damma it's حُ. With a kasra it's حِ. And with a sukoon after نَ, it's نَحۡ.</w:t>
+            </w:r>
+          </w:p>
+        </w:tc>
+        <w:tc>
+          <w:tcPr>
+            <w:tcW w:type="dxa" w:w="3000"/>
+          </w:tcPr>
+          <w:p>
+            <w:pPr>
+              <w:bidi/>
+              <w:jc w:val="center"/>
+            </w:pPr>
+            <w:r>
+              <w:rPr>
+                <w:rFonts w:ascii="KFGQPC HAFS Uthmanic Script" w:cs="KFGQPC HAFS Uthmanic Script" w:eastAsia="KFGQPC HAFS Uthmanic Script" w:hAnsi="KFGQPC HAFS Uthmanic Script"/>
+                <w:sz w:val="32"/>
+                <w:szCs w:val="32"/>
+                <w:rtl/>
+              </w:rPr>
+              <w:t xml:space="preserve">حَ حُ حِ نَحۡ</w:t>
+            </w:r>
+          </w:p>
+        </w:tc>
+      </w:tr>
+      <w:tr>
+        <w:tc>
+          <w:tcPr>
+            <w:tcW w:type="dxa" w:w="1900"/>
+          </w:tcPr>
+          <w:p>
+            <w:pPr>
+              <w:bidi/>
+              <w:jc w:val="center"/>
+            </w:pPr>
+            <w:r>
+              <w:rPr>
+                <w:rFonts w:ascii="KFGQPC HAFS Uthmanic Script" w:cs="KFGQPC HAFS Uthmanic Script" w:eastAsia="KFGQPC HAFS Uthmanic Script" w:hAnsi="KFGQPC HAFS Uthmanic Script"/>
+                <w:sz w:val="32"/>
+                <w:szCs w:val="32"/>
+                <w:rtl/>
+              </w:rPr>
+              <w:t xml:space="preserve">خ مقدمة</w:t>
+            </w:r>
+          </w:p>
+        </w:tc>
+        <w:tc>
+          <w:tcPr>
+            <w:tcW w:type="dxa" w:w="8060"/>
+          </w:tcPr>
+          <w:p>
+            <w:r>
+              <w:rPr>
+                <w:b w:val="false"/>
+                <w:bCs w:val="false"/>
+                <w:sz w:val="18"/>
+                <w:szCs w:val="18"/>
+              </w:rPr>
+              <w:t xml:space="preserve">This is the letter khaa. It looks like the same crescent moon. Look — one bubble on top. Khaa has one dot on top.</w:t>
+            </w:r>
+          </w:p>
+        </w:tc>
+        <w:tc>
+          <w:tcPr>
+            <w:tcW w:type="dxa" w:w="3000"/>
+          </w:tcPr>
+          <w:p>
+            <w:pPr>
+              <w:bidi/>
+              <w:jc w:val="center"/>
+            </w:pPr>
+          </w:p>
+        </w:tc>
+      </w:tr>
+      <w:tr>
+        <w:tc>
+          <w:tcPr>
+            <w:tcW w:type="dxa" w:w="1900"/>
+          </w:tcPr>
+          <w:p>
+            <w:pPr>
+              <w:bidi/>
+              <w:jc w:val="center"/>
+            </w:pPr>
+            <w:r>
+              <w:rPr>
+                <w:rFonts w:ascii="KFGQPC HAFS Uthmanic Script" w:cs="KFGQPC HAFS Uthmanic Script" w:eastAsia="KFGQPC HAFS Uthmanic Script" w:hAnsi="KFGQPC HAFS Uthmanic Script"/>
+                <w:sz w:val="32"/>
+                <w:szCs w:val="32"/>
+                <w:rtl/>
+              </w:rPr>
+              <w:t xml:space="preserve">خ حركات</w:t>
+            </w:r>
+          </w:p>
+        </w:tc>
+        <w:tc>
+          <w:tcPr>
+            <w:tcW w:type="dxa" w:w="8060"/>
+          </w:tcPr>
+          <w:p>
+            <w:r>
+              <w:rPr>
+                <w:b w:val="false"/>
+                <w:bCs w:val="false"/>
+                <w:sz w:val="18"/>
+                <w:szCs w:val="18"/>
+              </w:rPr>
+              <w:t xml:space="preserve">With a fatha it's خَ. With a damma it's خُ. With a kasra it's خِ. And with a sukoon after نَ, it's نَخۡ.</w:t>
+            </w:r>
+          </w:p>
+        </w:tc>
+        <w:tc>
+          <w:tcPr>
+            <w:tcW w:type="dxa" w:w="3000"/>
+          </w:tcPr>
+          <w:p>
+            <w:pPr>
+              <w:bidi/>
+              <w:jc w:val="center"/>
+            </w:pPr>
+            <w:r>
+              <w:rPr>
+                <w:rFonts w:ascii="KFGQPC HAFS Uthmanic Script" w:cs="KFGQPC HAFS Uthmanic Script" w:eastAsia="KFGQPC HAFS Uthmanic Script" w:hAnsi="KFGQPC HAFS Uthmanic Script"/>
+                <w:sz w:val="32"/>
+                <w:szCs w:val="32"/>
+                <w:rtl/>
+              </w:rPr>
+              <w:t xml:space="preserve">خَ خُ خِ نَخۡ</w:t>
+            </w:r>
+          </w:p>
+        </w:tc>
+      </w:tr>
+      <w:tr>
+        <w:tc>
+          <w:tcPr>
+            <w:tcW w:type="dxa" w:w="1900"/>
+          </w:tcPr>
+          <w:p>
+            <w:pPr>
+              <w:bidi/>
+              <w:jc w:val="center"/>
+            </w:pPr>
+            <w:r>
+              <w:rPr>
+                <w:rFonts w:ascii="KFGQPC HAFS Uthmanic Script" w:cs="KFGQPC HAFS Uthmanic Script" w:eastAsia="KFGQPC HAFS Uthmanic Script" w:hAnsi="KFGQPC HAFS Uthmanic Script"/>
+                <w:sz w:val="32"/>
+                <w:szCs w:val="32"/>
+                <w:rtl/>
+              </w:rPr>
+              <w:t xml:space="preserve">د مقدمة</w:t>
+            </w:r>
+          </w:p>
+        </w:tc>
+        <w:tc>
+          <w:tcPr>
+            <w:tcW w:type="dxa" w:w="8060"/>
+          </w:tcPr>
+          <w:p>
+            <w:r>
+              <w:rPr>
+                <w:b w:val="false"/>
+                <w:bCs w:val="false"/>
+                <w:sz w:val="18"/>
+                <w:szCs w:val="18"/>
+              </w:rPr>
+              <w:t xml:space="preserve">This is the letter daal. It looks like a fishing hook hanging high on its line. Look — no bubbles at all. Daal has no dots.</w:t>
+            </w:r>
+          </w:p>
+        </w:tc>
+        <w:tc>
+          <w:tcPr>
+            <w:tcW w:type="dxa" w:w="3000"/>
+          </w:tcPr>
+          <w:p>
+            <w:pPr>
+              <w:bidi/>
+              <w:jc w:val="center"/>
+            </w:pPr>
+          </w:p>
+        </w:tc>
+      </w:tr>
+      <w:tr>
+        <w:tc>
+          <w:tcPr>
+            <w:tcW w:type="dxa" w:w="1900"/>
+          </w:tcPr>
+          <w:p>
+            <w:pPr>
+              <w:bidi/>
+              <w:jc w:val="center"/>
+            </w:pPr>
+            <w:r>
+              <w:rPr>
+                <w:rFonts w:ascii="KFGQPC HAFS Uthmanic Script" w:cs="KFGQPC HAFS Uthmanic Script" w:eastAsia="KFGQPC HAFS Uthmanic Script" w:hAnsi="KFGQPC HAFS Uthmanic Script"/>
+                <w:sz w:val="32"/>
+                <w:szCs w:val="32"/>
+                <w:rtl/>
+              </w:rPr>
+              <w:t xml:space="preserve">د حركات</w:t>
+            </w:r>
+          </w:p>
+        </w:tc>
+        <w:tc>
+          <w:tcPr>
+            <w:tcW w:type="dxa" w:w="8060"/>
+          </w:tcPr>
+          <w:p>
+            <w:r>
+              <w:rPr>
+                <w:b w:val="false"/>
+                <w:bCs w:val="false"/>
+                <w:sz w:val="18"/>
+                <w:szCs w:val="18"/>
+              </w:rPr>
+              <w:t xml:space="preserve">With a fatha it's دَ. With a damma it's دُ. With a kasra it's دِ. And with a sukoon after نَ, it's نَدۡ.</w:t>
+            </w:r>
+          </w:p>
+        </w:tc>
+        <w:tc>
+          <w:tcPr>
+            <w:tcW w:type="dxa" w:w="3000"/>
+          </w:tcPr>
+          <w:p>
+            <w:pPr>
+              <w:bidi/>
+              <w:jc w:val="center"/>
+            </w:pPr>
+            <w:r>
+              <w:rPr>
+                <w:rFonts w:ascii="KFGQPC HAFS Uthmanic Script" w:cs="KFGQPC HAFS Uthmanic Script" w:eastAsia="KFGQPC HAFS Uthmanic Script" w:hAnsi="KFGQPC HAFS Uthmanic Script"/>
+                <w:sz w:val="32"/>
+                <w:szCs w:val="32"/>
+                <w:rtl/>
+              </w:rPr>
+              <w:t xml:space="preserve">دَ دُ دِ نَدۡ</w:t>
+            </w:r>
+          </w:p>
+        </w:tc>
+      </w:tr>
+      <w:tr>
+        <w:tc>
+          <w:tcPr>
+            <w:tcW w:type="dxa" w:w="1900"/>
+          </w:tcPr>
+          <w:p>
+            <w:pPr>
+              <w:bidi/>
+              <w:jc w:val="center"/>
+            </w:pPr>
+            <w:r>
+              <w:rPr>
+                <w:rFonts w:ascii="KFGQPC HAFS Uthmanic Script" w:cs="KFGQPC HAFS Uthmanic Script" w:eastAsia="KFGQPC HAFS Uthmanic Script" w:hAnsi="KFGQPC HAFS Uthmanic Script"/>
+                <w:sz w:val="32"/>
+                <w:szCs w:val="32"/>
+                <w:rtl/>
+              </w:rPr>
+              <w:t xml:space="preserve">ذ مقدمة</w:t>
+            </w:r>
+          </w:p>
+        </w:tc>
+        <w:tc>
+          <w:tcPr>
+            <w:tcW w:type="dxa" w:w="8060"/>
+          </w:tcPr>
+          <w:p>
+            <w:r>
+              <w:rPr>
+                <w:b w:val="false"/>
+                <w:bCs w:val="false"/>
+                <w:sz w:val="18"/>
+                <w:szCs w:val="18"/>
+              </w:rPr>
+              <w:t xml:space="preserve">This is the letter dhaal. It looks like the same hanging hook. Look — one bubble on top. Dhaal has one dot on top.</w:t>
+            </w:r>
+          </w:p>
+        </w:tc>
+        <w:tc>
+          <w:tcPr>
+            <w:tcW w:type="dxa" w:w="3000"/>
+          </w:tcPr>
+          <w:p>
+            <w:pPr>
+              <w:bidi/>
+              <w:jc w:val="center"/>
+            </w:pPr>
+          </w:p>
+        </w:tc>
+      </w:tr>
+      <w:tr>
+        <w:tc>
+          <w:tcPr>
+            <w:tcW w:type="dxa" w:w="1900"/>
+          </w:tcPr>
+          <w:p>
+            <w:pPr>
+              <w:bidi/>
+              <w:jc w:val="center"/>
+            </w:pPr>
+            <w:r>
+              <w:rPr>
+                <w:rFonts w:ascii="KFGQPC HAFS Uthmanic Script" w:cs="KFGQPC HAFS Uthmanic Script" w:eastAsia="KFGQPC HAFS Uthmanic Script" w:hAnsi="KFGQPC HAFS Uthmanic Script"/>
+                <w:sz w:val="32"/>
+                <w:szCs w:val="32"/>
+                <w:rtl/>
+              </w:rPr>
+              <w:t xml:space="preserve">ذ حركات</w:t>
+            </w:r>
+          </w:p>
+        </w:tc>
+        <w:tc>
+          <w:tcPr>
+            <w:tcW w:type="dxa" w:w="8060"/>
+          </w:tcPr>
+          <w:p>
+            <w:r>
+              <w:rPr>
+                <w:b w:val="false"/>
+                <w:bCs w:val="false"/>
+                <w:sz w:val="18"/>
+                <w:szCs w:val="18"/>
+              </w:rPr>
+              <w:t xml:space="preserve">With a fatha it's ذَ. With a damma it's ذُ. With a kasra it's ذِ. And with a sukoon after نَ, it's نَذۡ.</w:t>
+            </w:r>
+          </w:p>
+        </w:tc>
+        <w:tc>
+          <w:tcPr>
+            <w:tcW w:type="dxa" w:w="3000"/>
+          </w:tcPr>
+          <w:p>
+            <w:pPr>
+              <w:bidi/>
+              <w:jc w:val="center"/>
+            </w:pPr>
+            <w:r>
+              <w:rPr>
+                <w:rFonts w:ascii="KFGQPC HAFS Uthmanic Script" w:cs="KFGQPC HAFS Uthmanic Script" w:eastAsia="KFGQPC HAFS Uthmanic Script" w:hAnsi="KFGQPC HAFS Uthmanic Script"/>
+                <w:sz w:val="32"/>
+                <w:szCs w:val="32"/>
+                <w:rtl/>
+              </w:rPr>
+              <w:t xml:space="preserve">ذَ ذُ ذِ نَذۡ</w:t>
+            </w:r>
+          </w:p>
+        </w:tc>
+      </w:tr>
+      <w:tr>
+        <w:tc>
+          <w:tcPr>
+            <w:tcW w:type="dxa" w:w="1900"/>
+          </w:tcPr>
+          <w:p>
+            <w:pPr>
+              <w:bidi/>
+              <w:jc w:val="center"/>
+            </w:pPr>
+            <w:r>
+              <w:rPr>
+                <w:rFonts w:ascii="KFGQPC HAFS Uthmanic Script" w:cs="KFGQPC HAFS Uthmanic Script" w:eastAsia="KFGQPC HAFS Uthmanic Script" w:hAnsi="KFGQPC HAFS Uthmanic Script"/>
+                <w:sz w:val="32"/>
+                <w:szCs w:val="32"/>
+                <w:rtl/>
+              </w:rPr>
+              <w:t xml:space="preserve">ر مقدمة</w:t>
+            </w:r>
+          </w:p>
+        </w:tc>
+        <w:tc>
+          <w:tcPr>
+            <w:tcW w:type="dxa" w:w="8060"/>
+          </w:tcPr>
+          <w:p>
+            <w:r>
+              <w:rPr>
+                <w:b w:val="false"/>
+                <w:bCs w:val="false"/>
+                <w:sz w:val="18"/>
+                <w:szCs w:val="18"/>
+              </w:rPr>
+              <w:t xml:space="preserve">This is the letter raa. It looks like a fishing hook lying down on the sand. Look — no bubbles at all. Raa has no dots.</w:t>
+            </w:r>
+          </w:p>
+        </w:tc>
+        <w:tc>
+          <w:tcPr>
+            <w:tcW w:type="dxa" w:w="3000"/>
+          </w:tcPr>
+          <w:p>
+            <w:pPr>
+              <w:bidi/>
+              <w:jc w:val="center"/>
+            </w:pPr>
+          </w:p>
+        </w:tc>
+      </w:tr>
+      <w:tr>
+        <w:tc>
+          <w:tcPr>
+            <w:tcW w:type="dxa" w:w="1900"/>
+          </w:tcPr>
+          <w:p>
+            <w:pPr>
+              <w:bidi/>
+              <w:jc w:val="center"/>
+            </w:pPr>
+            <w:r>
+              <w:rPr>
+                <w:rFonts w:ascii="KFGQPC HAFS Uthmanic Script" w:cs="KFGQPC HAFS Uthmanic Script" w:eastAsia="KFGQPC HAFS Uthmanic Script" w:hAnsi="KFGQPC HAFS Uthmanic Script"/>
+                <w:sz w:val="32"/>
+                <w:szCs w:val="32"/>
+                <w:rtl/>
+              </w:rPr>
+              <w:t xml:space="preserve">ر حركات</w:t>
+            </w:r>
+          </w:p>
+        </w:tc>
+        <w:tc>
+          <w:tcPr>
+            <w:tcW w:type="dxa" w:w="8060"/>
+          </w:tcPr>
+          <w:p>
+            <w:r>
+              <w:rPr>
+                <w:b w:val="false"/>
+                <w:bCs w:val="false"/>
+                <w:sz w:val="18"/>
+                <w:szCs w:val="18"/>
+              </w:rPr>
+              <w:t xml:space="preserve">With a fatha it's رَ. With a damma it's رُ. With a kasra it's رِ. And with a sukoon after نَ, it's نَرۡ.</w:t>
+            </w:r>
+          </w:p>
+        </w:tc>
+        <w:tc>
+          <w:tcPr>
+            <w:tcW w:type="dxa" w:w="3000"/>
+          </w:tcPr>
+          <w:p>
+            <w:pPr>
+              <w:bidi/>
+              <w:jc w:val="center"/>
+            </w:pPr>
+            <w:r>
+              <w:rPr>
+                <w:rFonts w:ascii="KFGQPC HAFS Uthmanic Script" w:cs="KFGQPC HAFS Uthmanic Script" w:eastAsia="KFGQPC HAFS Uthmanic Script" w:hAnsi="KFGQPC HAFS Uthmanic Script"/>
+                <w:sz w:val="32"/>
+                <w:szCs w:val="32"/>
+                <w:rtl/>
+              </w:rPr>
+              <w:t xml:space="preserve">رَ رُ رِ نَرۡ</w:t>
+            </w:r>
+          </w:p>
+        </w:tc>
+      </w:tr>
+      <w:tr>
+        <w:tc>
+          <w:tcPr>
+            <w:tcW w:type="dxa" w:w="1900"/>
+          </w:tcPr>
+          <w:p>
+            <w:pPr>
+              <w:bidi/>
+              <w:jc w:val="center"/>
+            </w:pPr>
+            <w:r>
+              <w:rPr>
+                <w:rFonts w:ascii="KFGQPC HAFS Uthmanic Script" w:cs="KFGQPC HAFS Uthmanic Script" w:eastAsia="KFGQPC HAFS Uthmanic Script" w:hAnsi="KFGQPC HAFS Uthmanic Script"/>
+                <w:sz w:val="32"/>
+                <w:szCs w:val="32"/>
+                <w:rtl/>
+              </w:rPr>
+              <w:t xml:space="preserve">ز مقدمة</w:t>
+            </w:r>
+          </w:p>
+        </w:tc>
+        <w:tc>
+          <w:tcPr>
+            <w:tcW w:type="dxa" w:w="8060"/>
+          </w:tcPr>
+          <w:p>
+            <w:r>
+              <w:rPr>
+                <w:b w:val="false"/>
+                <w:bCs w:val="false"/>
+                <w:sz w:val="18"/>
+                <w:szCs w:val="18"/>
+              </w:rPr>
+              <w:t xml:space="preserve">This is the letter zaay. It looks like the same hook on the sand. Look — one bubble on top. Zaay has one dot on top.</w:t>
+            </w:r>
+          </w:p>
+        </w:tc>
+        <w:tc>
+          <w:tcPr>
+            <w:tcW w:type="dxa" w:w="3000"/>
+          </w:tcPr>
+          <w:p>
+            <w:pPr>
+              <w:bidi/>
+              <w:jc w:val="center"/>
+            </w:pPr>
+          </w:p>
+        </w:tc>
+      </w:tr>
+      <w:tr>
+        <w:tc>
+          <w:tcPr>
+            <w:tcW w:type="dxa" w:w="1900"/>
+          </w:tcPr>
+          <w:p>
+            <w:pPr>
+              <w:bidi/>
+              <w:jc w:val="center"/>
+            </w:pPr>
+            <w:r>
+              <w:rPr>
+                <w:rFonts w:ascii="KFGQPC HAFS Uthmanic Script" w:cs="KFGQPC HAFS Uthmanic Script" w:eastAsia="KFGQPC HAFS Uthmanic Script" w:hAnsi="KFGQPC HAFS Uthmanic Script"/>
+                <w:sz w:val="32"/>
+                <w:szCs w:val="32"/>
+                <w:rtl/>
+              </w:rPr>
+              <w:t xml:space="preserve">ز حركات</w:t>
+            </w:r>
+          </w:p>
+        </w:tc>
+        <w:tc>
+          <w:tcPr>
+            <w:tcW w:type="dxa" w:w="8060"/>
+          </w:tcPr>
+          <w:p>
+            <w:r>
+              <w:rPr>
+                <w:b w:val="false"/>
+                <w:bCs w:val="false"/>
+                <w:sz w:val="18"/>
+                <w:szCs w:val="18"/>
+              </w:rPr>
+              <w:t xml:space="preserve">With a fatha it's زَ. With a damma it's زُ. With a kasra it's زِ. And with a sukoon after نَ, it's نَزۡ.</w:t>
+            </w:r>
+          </w:p>
+        </w:tc>
+        <w:tc>
+          <w:tcPr>
+            <w:tcW w:type="dxa" w:w="3000"/>
+          </w:tcPr>
+          <w:p>
+            <w:pPr>
+              <w:bidi/>
+              <w:jc w:val="center"/>
+            </w:pPr>
+            <w:r>
+              <w:rPr>
+                <w:rFonts w:ascii="KFGQPC HAFS Uthmanic Script" w:cs="KFGQPC HAFS Uthmanic Script" w:eastAsia="KFGQPC HAFS Uthmanic Script" w:hAnsi="KFGQPC HAFS Uthmanic Script"/>
+                <w:sz w:val="32"/>
+                <w:szCs w:val="32"/>
+                <w:rtl/>
+              </w:rPr>
+              <w:t xml:space="preserve">زَ زُ زِ نَزۡ</w:t>
+            </w:r>
+          </w:p>
+        </w:tc>
+      </w:tr>
+      <w:tr>
+        <w:tc>
+          <w:tcPr>
+            <w:tcW w:type="dxa" w:w="1900"/>
+          </w:tcPr>
+          <w:p>
+            <w:pPr>
+              <w:bidi/>
+              <w:jc w:val="center"/>
+            </w:pPr>
+            <w:r>
+              <w:rPr>
+                <w:rFonts w:ascii="KFGQPC HAFS Uthmanic Script" w:cs="KFGQPC HAFS Uthmanic Script" w:eastAsia="KFGQPC HAFS Uthmanic Script" w:hAnsi="KFGQPC HAFS Uthmanic Script"/>
+                <w:sz w:val="32"/>
+                <w:szCs w:val="32"/>
+                <w:rtl/>
+              </w:rPr>
+              <w:t xml:space="preserve">س مقدمة</w:t>
+            </w:r>
+          </w:p>
+        </w:tc>
+        <w:tc>
+          <w:tcPr>
+            <w:tcW w:type="dxa" w:w="8060"/>
+          </w:tcPr>
+          <w:p>
+            <w:r>
+              <w:rPr>
+                <w:b w:val="false"/>
+                <w:bCs w:val="false"/>
+                <w:sz w:val="18"/>
+                <w:szCs w:val="18"/>
+              </w:rPr>
+              <w:t xml:space="preserve">This is the letter seen. It looks like a sea snake with three humps. Look — no bubbles at all. Seen has no dots.</w:t>
+            </w:r>
+          </w:p>
+        </w:tc>
+        <w:tc>
+          <w:tcPr>
+            <w:tcW w:type="dxa" w:w="3000"/>
+          </w:tcPr>
+          <w:p>
+            <w:pPr>
+              <w:bidi/>
+              <w:jc w:val="center"/>
+            </w:pPr>
+          </w:p>
+        </w:tc>
+      </w:tr>
+      <w:tr>
+        <w:tc>
+          <w:tcPr>
+            <w:tcW w:type="dxa" w:w="1900"/>
+          </w:tcPr>
+          <w:p>
+            <w:pPr>
+              <w:bidi/>
+              <w:jc w:val="center"/>
+            </w:pPr>
+            <w:r>
+              <w:rPr>
+                <w:rFonts w:ascii="KFGQPC HAFS Uthmanic Script" w:cs="KFGQPC HAFS Uthmanic Script" w:eastAsia="KFGQPC HAFS Uthmanic Script" w:hAnsi="KFGQPC HAFS Uthmanic Script"/>
+                <w:sz w:val="32"/>
+                <w:szCs w:val="32"/>
+                <w:rtl/>
+              </w:rPr>
+              <w:t xml:space="preserve">س حركات</w:t>
+            </w:r>
+          </w:p>
+        </w:tc>
+        <w:tc>
+          <w:tcPr>
+            <w:tcW w:type="dxa" w:w="8060"/>
+          </w:tcPr>
+          <w:p>
+            <w:r>
+              <w:rPr>
+                <w:b w:val="false"/>
+                <w:bCs w:val="false"/>
+                <w:sz w:val="18"/>
+                <w:szCs w:val="18"/>
+              </w:rPr>
+              <w:t xml:space="preserve">With a fatha it's سَ. With a damma it's سُ. With a kasra it's سِ. And with a sukoon after نَ, it's نَسۡ.</w:t>
+            </w:r>
+          </w:p>
+        </w:tc>
+        <w:tc>
+          <w:tcPr>
+            <w:tcW w:type="dxa" w:w="3000"/>
+          </w:tcPr>
+          <w:p>
+            <w:pPr>
+              <w:bidi/>
+              <w:jc w:val="center"/>
+            </w:pPr>
+            <w:r>
+              <w:rPr>
+                <w:rFonts w:ascii="KFGQPC HAFS Uthmanic Script" w:cs="KFGQPC HAFS Uthmanic Script" w:eastAsia="KFGQPC HAFS Uthmanic Script" w:hAnsi="KFGQPC HAFS Uthmanic Script"/>
+                <w:sz w:val="32"/>
+                <w:szCs w:val="32"/>
+                <w:rtl/>
+              </w:rPr>
+              <w:t xml:space="preserve">سَ سُ سِ نَسۡ</w:t>
+            </w:r>
+          </w:p>
+        </w:tc>
+      </w:tr>
+      <w:tr>
+        <w:tc>
+          <w:tcPr>
+            <w:tcW w:type="dxa" w:w="1900"/>
+          </w:tcPr>
+          <w:p>
+            <w:pPr>
+              <w:bidi/>
+              <w:jc w:val="center"/>
+            </w:pPr>
+            <w:r>
+              <w:rPr>
+                <w:rFonts w:ascii="KFGQPC HAFS Uthmanic Script" w:cs="KFGQPC HAFS Uthmanic Script" w:eastAsia="KFGQPC HAFS Uthmanic Script" w:hAnsi="KFGQPC HAFS Uthmanic Script"/>
+                <w:sz w:val="32"/>
+                <w:szCs w:val="32"/>
+                <w:rtl/>
+              </w:rPr>
+              <w:t xml:space="preserve">ش مقدمة</w:t>
+            </w:r>
+          </w:p>
+        </w:tc>
+        <w:tc>
+          <w:tcPr>
+            <w:tcW w:type="dxa" w:w="8060"/>
+          </w:tcPr>
+          <w:p>
+            <w:r>
+              <w:rPr>
+                <w:b w:val="false"/>
+                <w:bCs w:val="false"/>
+                <w:sz w:val="18"/>
+                <w:szCs w:val="18"/>
+              </w:rPr>
+              <w:t xml:space="preserve">This is the letter sheen. It looks like the same snake. Look — three bubbles on top. Sheen has three dots on top.</w:t>
+            </w:r>
+          </w:p>
+        </w:tc>
+        <w:tc>
+          <w:tcPr>
+            <w:tcW w:type="dxa" w:w="3000"/>
+          </w:tcPr>
+          <w:p>
+            <w:pPr>
+              <w:bidi/>
+              <w:jc w:val="center"/>
+            </w:pPr>
+          </w:p>
+        </w:tc>
+      </w:tr>
+      <w:tr>
+        <w:tc>
+          <w:tcPr>
+            <w:tcW w:type="dxa" w:w="1900"/>
+          </w:tcPr>
+          <w:p>
+            <w:pPr>
+              <w:bidi/>
+              <w:jc w:val="center"/>
+            </w:pPr>
+            <w:r>
+              <w:rPr>
+                <w:rFonts w:ascii="KFGQPC HAFS Uthmanic Script" w:cs="KFGQPC HAFS Uthmanic Script" w:eastAsia="KFGQPC HAFS Uthmanic Script" w:hAnsi="KFGQPC HAFS Uthmanic Script"/>
+                <w:sz w:val="32"/>
+                <w:szCs w:val="32"/>
+                <w:rtl/>
+              </w:rPr>
+              <w:t xml:space="preserve">ش حركات</w:t>
+            </w:r>
+          </w:p>
+        </w:tc>
+        <w:tc>
+          <w:tcPr>
+            <w:tcW w:type="dxa" w:w="8060"/>
+          </w:tcPr>
+          <w:p>
+            <w:r>
+              <w:rPr>
+                <w:b w:val="false"/>
+                <w:bCs w:val="false"/>
+                <w:sz w:val="18"/>
+                <w:szCs w:val="18"/>
+              </w:rPr>
+              <w:t xml:space="preserve">With a fatha it's شَ. With a damma it's شُ. With a kasra it's شِ. And with a sukoon after نَ, it's نَشۡ.</w:t>
+            </w:r>
+          </w:p>
+        </w:tc>
+        <w:tc>
+          <w:tcPr>
+            <w:tcW w:type="dxa" w:w="3000"/>
+          </w:tcPr>
+          <w:p>
+            <w:pPr>
+              <w:bidi/>
+              <w:jc w:val="center"/>
+            </w:pPr>
+            <w:r>
+              <w:rPr>
+                <w:rFonts w:ascii="KFGQPC HAFS Uthmanic Script" w:cs="KFGQPC HAFS Uthmanic Script" w:eastAsia="KFGQPC HAFS Uthmanic Script" w:hAnsi="KFGQPC HAFS Uthmanic Script"/>
+                <w:sz w:val="32"/>
+                <w:szCs w:val="32"/>
+                <w:rtl/>
+              </w:rPr>
+              <w:t xml:space="preserve">شَ شُ شِ نَشۡ</w:t>
+            </w:r>
+          </w:p>
+        </w:tc>
+      </w:tr>
+      <w:tr>
+        <w:tc>
+          <w:tcPr>
+            <w:tcW w:type="dxa" w:w="1900"/>
+          </w:tcPr>
+          <w:p>
+            <w:pPr>
+              <w:bidi/>
+              <w:jc w:val="center"/>
+            </w:pPr>
+            <w:r>
+              <w:rPr>
+                <w:rFonts w:ascii="KFGQPC HAFS Uthmanic Script" w:cs="KFGQPC HAFS Uthmanic Script" w:eastAsia="KFGQPC HAFS Uthmanic Script" w:hAnsi="KFGQPC HAFS Uthmanic Script"/>
+                <w:sz w:val="32"/>
+                <w:szCs w:val="32"/>
+                <w:rtl/>
+              </w:rPr>
+              <w:t xml:space="preserve">ص مقدمة</w:t>
+            </w:r>
+          </w:p>
+        </w:tc>
+        <w:tc>
+          <w:tcPr>
+            <w:tcW w:type="dxa" w:w="8060"/>
+          </w:tcPr>
+          <w:p>
+            <w:r>
+              <w:rPr>
+                <w:b w:val="false"/>
+                <w:bCs w:val="false"/>
+                <w:sz w:val="18"/>
+                <w:szCs w:val="18"/>
+              </w:rPr>
+              <w:t xml:space="preserve">This is the letter ṣaad. It looks like a whale with a long flat tail. Look — no bubbles at all. Ṣaad has no dots.</w:t>
+            </w:r>
+          </w:p>
+        </w:tc>
+        <w:tc>
+          <w:tcPr>
+            <w:tcW w:type="dxa" w:w="3000"/>
+          </w:tcPr>
+          <w:p>
+            <w:pPr>
+              <w:bidi/>
+              <w:jc w:val="center"/>
+            </w:pPr>
+          </w:p>
+        </w:tc>
+      </w:tr>
+      <w:tr>
+        <w:tc>
+          <w:tcPr>
+            <w:tcW w:type="dxa" w:w="1900"/>
+          </w:tcPr>
+          <w:p>
+            <w:pPr>
+              <w:bidi/>
+              <w:jc w:val="center"/>
+            </w:pPr>
+            <w:r>
+              <w:rPr>
+                <w:rFonts w:ascii="KFGQPC HAFS Uthmanic Script" w:cs="KFGQPC HAFS Uthmanic Script" w:eastAsia="KFGQPC HAFS Uthmanic Script" w:hAnsi="KFGQPC HAFS Uthmanic Script"/>
+                <w:sz w:val="32"/>
+                <w:szCs w:val="32"/>
+                <w:rtl/>
+              </w:rPr>
+              <w:t xml:space="preserve">ص حركات</w:t>
+            </w:r>
+          </w:p>
+        </w:tc>
+        <w:tc>
+          <w:tcPr>
+            <w:tcW w:type="dxa" w:w="8060"/>
+          </w:tcPr>
+          <w:p>
+            <w:r>
+              <w:rPr>
+                <w:b w:val="false"/>
+                <w:bCs w:val="false"/>
+                <w:sz w:val="18"/>
+                <w:szCs w:val="18"/>
+              </w:rPr>
+              <w:t xml:space="preserve">With a fatha it's صَ. With a damma it's صُ. With a kasra it's صِ. And with a sukoon after نَ, it's نَصۡ.</w:t>
+            </w:r>
+          </w:p>
+        </w:tc>
+        <w:tc>
+          <w:tcPr>
+            <w:tcW w:type="dxa" w:w="3000"/>
+          </w:tcPr>
+          <w:p>
+            <w:pPr>
+              <w:bidi/>
+              <w:jc w:val="center"/>
+            </w:pPr>
+            <w:r>
+              <w:rPr>
+                <w:rFonts w:ascii="KFGQPC HAFS Uthmanic Script" w:cs="KFGQPC HAFS Uthmanic Script" w:eastAsia="KFGQPC HAFS Uthmanic Script" w:hAnsi="KFGQPC HAFS Uthmanic Script"/>
+                <w:sz w:val="32"/>
+                <w:szCs w:val="32"/>
+                <w:rtl/>
+              </w:rPr>
+              <w:t xml:space="preserve">صَ صُ صِ نَصۡ</w:t>
+            </w:r>
+          </w:p>
+        </w:tc>
+      </w:tr>
+      <w:tr>
+        <w:tc>
+          <w:tcPr>
+            <w:tcW w:type="dxa" w:w="1900"/>
+          </w:tcPr>
+          <w:p>
+            <w:pPr>
+              <w:bidi/>
+              <w:jc w:val="center"/>
+            </w:pPr>
+            <w:r>
+              <w:rPr>
+                <w:rFonts w:ascii="KFGQPC HAFS Uthmanic Script" w:cs="KFGQPC HAFS Uthmanic Script" w:eastAsia="KFGQPC HAFS Uthmanic Script" w:hAnsi="KFGQPC HAFS Uthmanic Script"/>
+                <w:sz w:val="32"/>
+                <w:szCs w:val="32"/>
+                <w:rtl/>
+              </w:rPr>
+              <w:t xml:space="preserve">ض مقدمة</w:t>
+            </w:r>
+          </w:p>
+        </w:tc>
+        <w:tc>
+          <w:tcPr>
+            <w:tcW w:type="dxa" w:w="8060"/>
+          </w:tcPr>
+          <w:p>
+            <w:r>
+              <w:rPr>
+                <w:b w:val="false"/>
+                <w:bCs w:val="false"/>
+                <w:sz w:val="18"/>
+                <w:szCs w:val="18"/>
+              </w:rPr>
+              <w:t xml:space="preserve">This is the letter ḍaad. It looks like the same whale. Look — one bubble on top. Ḍaad has one dot on top.</w:t>
+            </w:r>
+          </w:p>
+        </w:tc>
+        <w:tc>
+          <w:tcPr>
+            <w:tcW w:type="dxa" w:w="3000"/>
+          </w:tcPr>
+          <w:p>
+            <w:pPr>
+              <w:bidi/>
+              <w:jc w:val="center"/>
+            </w:pPr>
+          </w:p>
+        </w:tc>
+      </w:tr>
+      <w:tr>
+        <w:tc>
+          <w:tcPr>
+            <w:tcW w:type="dxa" w:w="1900"/>
+          </w:tcPr>
+          <w:p>
+            <w:pPr>
+              <w:bidi/>
+              <w:jc w:val="center"/>
+            </w:pPr>
+            <w:r>
+              <w:rPr>
+                <w:rFonts w:ascii="KFGQPC HAFS Uthmanic Script" w:cs="KFGQPC HAFS Uthmanic Script" w:eastAsia="KFGQPC HAFS Uthmanic Script" w:hAnsi="KFGQPC HAFS Uthmanic Script"/>
+                <w:sz w:val="32"/>
+                <w:szCs w:val="32"/>
+                <w:rtl/>
+              </w:rPr>
+              <w:t xml:space="preserve">ض حركات</w:t>
+            </w:r>
+          </w:p>
+        </w:tc>
+        <w:tc>
+          <w:tcPr>
+            <w:tcW w:type="dxa" w:w="8060"/>
+          </w:tcPr>
+          <w:p>
+            <w:r>
+              <w:rPr>
+                <w:b w:val="false"/>
+                <w:bCs w:val="false"/>
+                <w:sz w:val="18"/>
+                <w:szCs w:val="18"/>
+              </w:rPr>
+              <w:t xml:space="preserve">With a fatha it's ضَ. With a damma it's ضُ. With a kasra it's ضِ. And with a sukoon after نَ, it's نَضۡ.</w:t>
+            </w:r>
+          </w:p>
+        </w:tc>
+        <w:tc>
+          <w:tcPr>
+            <w:tcW w:type="dxa" w:w="3000"/>
+          </w:tcPr>
+          <w:p>
+            <w:pPr>
+              <w:bidi/>
+              <w:jc w:val="center"/>
+            </w:pPr>
+            <w:r>
+              <w:rPr>
+                <w:rFonts w:ascii="KFGQPC HAFS Uthmanic Script" w:cs="KFGQPC HAFS Uthmanic Script" w:eastAsia="KFGQPC HAFS Uthmanic Script" w:hAnsi="KFGQPC HAFS Uthmanic Script"/>
+                <w:sz w:val="32"/>
+                <w:szCs w:val="32"/>
+                <w:rtl/>
+              </w:rPr>
+              <w:t xml:space="preserve">ضَ ضُ ضِ نَضۡ</w:t>
+            </w:r>
+          </w:p>
+        </w:tc>
+      </w:tr>
+      <w:tr>
+        <w:tc>
+          <w:tcPr>
+            <w:tcW w:type="dxa" w:w="1900"/>
+          </w:tcPr>
+          <w:p>
+            <w:pPr>
+              <w:bidi/>
+              <w:jc w:val="center"/>
+            </w:pPr>
+            <w:r>
+              <w:rPr>
+                <w:rFonts w:ascii="KFGQPC HAFS Uthmanic Script" w:cs="KFGQPC HAFS Uthmanic Script" w:eastAsia="KFGQPC HAFS Uthmanic Script" w:hAnsi="KFGQPC HAFS Uthmanic Script"/>
+                <w:sz w:val="32"/>
+                <w:szCs w:val="32"/>
+                <w:rtl/>
+              </w:rPr>
+              <w:t xml:space="preserve">ط مقدمة</w:t>
+            </w:r>
+          </w:p>
+        </w:tc>
+        <w:tc>
+          <w:tcPr>
+            <w:tcW w:type="dxa" w:w="8060"/>
+          </w:tcPr>
+          <w:p>
+            <w:r>
+              <w:rPr>
+                <w:b w:val="false"/>
+                <w:bCs w:val="false"/>
+                <w:sz w:val="18"/>
+                <w:szCs w:val="18"/>
+              </w:rPr>
+              <w:t xml:space="preserve">This is the letter ṭaa. It looks like the whale spouting water straight up. Look — no bubbles at all. Ṭaa has no dots.</w:t>
+            </w:r>
+          </w:p>
+        </w:tc>
+        <w:tc>
+          <w:tcPr>
+            <w:tcW w:type="dxa" w:w="3000"/>
+          </w:tcPr>
+          <w:p>
+            <w:pPr>
+              <w:bidi/>
+              <w:jc w:val="center"/>
+            </w:pPr>
+          </w:p>
+        </w:tc>
+      </w:tr>
+      <w:tr>
+        <w:tc>
+          <w:tcPr>
+            <w:tcW w:type="dxa" w:w="1900"/>
+          </w:tcPr>
+          <w:p>
+            <w:pPr>
+              <w:bidi/>
+              <w:jc w:val="center"/>
+            </w:pPr>
+            <w:r>
+              <w:rPr>
+                <w:rFonts w:ascii="KFGQPC HAFS Uthmanic Script" w:cs="KFGQPC HAFS Uthmanic Script" w:eastAsia="KFGQPC HAFS Uthmanic Script" w:hAnsi="KFGQPC HAFS Uthmanic Script"/>
+                <w:sz w:val="32"/>
+                <w:szCs w:val="32"/>
+                <w:rtl/>
+              </w:rPr>
+              <w:t xml:space="preserve">ط حركات</w:t>
+            </w:r>
+          </w:p>
+        </w:tc>
+        <w:tc>
+          <w:tcPr>
+            <w:tcW w:type="dxa" w:w="8060"/>
+          </w:tcPr>
+          <w:p>
+            <w:r>
+              <w:rPr>
+                <w:b w:val="false"/>
+                <w:bCs w:val="false"/>
+                <w:sz w:val="18"/>
+                <w:szCs w:val="18"/>
+              </w:rPr>
+              <w:t xml:space="preserve">With a fatha it's طَ. With a damma it's طُ. With a kasra it's طِ. And with a sukoon after نَ, it's نَطۡ.</w:t>
+            </w:r>
+          </w:p>
+        </w:tc>
+        <w:tc>
+          <w:tcPr>
+            <w:tcW w:type="dxa" w:w="3000"/>
+          </w:tcPr>
+          <w:p>
+            <w:pPr>
+              <w:bidi/>
+              <w:jc w:val="center"/>
+            </w:pPr>
+            <w:r>
+              <w:rPr>
+                <w:rFonts w:ascii="KFGQPC HAFS Uthmanic Script" w:cs="KFGQPC HAFS Uthmanic Script" w:eastAsia="KFGQPC HAFS Uthmanic Script" w:hAnsi="KFGQPC HAFS Uthmanic Script"/>
+                <w:sz w:val="32"/>
+                <w:szCs w:val="32"/>
+                <w:rtl/>
+              </w:rPr>
+              <w:t xml:space="preserve">طَ طُ طِ نَطۡ</w:t>
+            </w:r>
+          </w:p>
+        </w:tc>
+      </w:tr>
+      <w:tr>
+        <w:tc>
+          <w:tcPr>
+            <w:tcW w:type="dxa" w:w="1900"/>
+          </w:tcPr>
+          <w:p>
+            <w:pPr>
+              <w:bidi/>
+              <w:jc w:val="center"/>
+            </w:pPr>
+            <w:r>
+              <w:rPr>
+                <w:rFonts w:ascii="KFGQPC HAFS Uthmanic Script" w:cs="KFGQPC HAFS Uthmanic Script" w:eastAsia="KFGQPC HAFS Uthmanic Script" w:hAnsi="KFGQPC HAFS Uthmanic Script"/>
+                <w:sz w:val="32"/>
+                <w:szCs w:val="32"/>
+                <w:rtl/>
+              </w:rPr>
+              <w:t xml:space="preserve">ظ مقدمة</w:t>
+            </w:r>
+          </w:p>
+        </w:tc>
+        <w:tc>
+          <w:tcPr>
+            <w:tcW w:type="dxa" w:w="8060"/>
+          </w:tcPr>
+          <w:p>
+            <w:r>
+              <w:rPr>
+                <w:b w:val="false"/>
+                <w:bCs w:val="false"/>
+                <w:sz w:val="18"/>
+                <w:szCs w:val="18"/>
+              </w:rPr>
+              <w:t xml:space="preserve">This is the letter ẓaa. It looks like the same spouting whale. Look — one bubble on top. Ẓaa has one dot on top.</w:t>
+            </w:r>
+          </w:p>
+        </w:tc>
+        <w:tc>
+          <w:tcPr>
+            <w:tcW w:type="dxa" w:w="3000"/>
+          </w:tcPr>
+          <w:p>
+            <w:pPr>
+              <w:bidi/>
+              <w:jc w:val="center"/>
+            </w:pPr>
+          </w:p>
+        </w:tc>
+      </w:tr>
+      <w:tr>
+        <w:tc>
+          <w:tcPr>
+            <w:tcW w:type="dxa" w:w="1900"/>
+          </w:tcPr>
+          <w:p>
+            <w:pPr>
+              <w:bidi/>
+              <w:jc w:val="center"/>
+            </w:pPr>
+            <w:r>
+              <w:rPr>
+                <w:rFonts w:ascii="KFGQPC HAFS Uthmanic Script" w:cs="KFGQPC HAFS Uthmanic Script" w:eastAsia="KFGQPC HAFS Uthmanic Script" w:hAnsi="KFGQPC HAFS Uthmanic Script"/>
+                <w:sz w:val="32"/>
+                <w:szCs w:val="32"/>
+                <w:rtl/>
+              </w:rPr>
+              <w:t xml:space="preserve">ظ حركات</w:t>
+            </w:r>
+          </w:p>
+        </w:tc>
+        <w:tc>
+          <w:tcPr>
+            <w:tcW w:type="dxa" w:w="8060"/>
+          </w:tcPr>
+          <w:p>
+            <w:r>
+              <w:rPr>
+                <w:b w:val="false"/>
+                <w:bCs w:val="false"/>
+                <w:sz w:val="18"/>
+                <w:szCs w:val="18"/>
+              </w:rPr>
+              <w:t xml:space="preserve">With a fatha it's ظَ. With a damma it's ظُ. With a kasra it's ظِ. And with a sukoon after نَ, it's نَظۡ.</w:t>
+            </w:r>
+          </w:p>
+        </w:tc>
+        <w:tc>
+          <w:tcPr>
+            <w:tcW w:type="dxa" w:w="3000"/>
+          </w:tcPr>
+          <w:p>
+            <w:pPr>
+              <w:bidi/>
+              <w:jc w:val="center"/>
+            </w:pPr>
+            <w:r>
+              <w:rPr>
+                <w:rFonts w:ascii="KFGQPC HAFS Uthmanic Script" w:cs="KFGQPC HAFS Uthmanic Script" w:eastAsia="KFGQPC HAFS Uthmanic Script" w:hAnsi="KFGQPC HAFS Uthmanic Script"/>
+                <w:sz w:val="32"/>
+                <w:szCs w:val="32"/>
+                <w:rtl/>
+              </w:rPr>
+              <w:t xml:space="preserve">ظَ ظُ ظِ نَظۡ</w:t>
+            </w:r>
+          </w:p>
+        </w:tc>
+      </w:tr>
+      <w:tr>
+        <w:tc>
+          <w:tcPr>
+            <w:tcW w:type="dxa" w:w="1900"/>
+          </w:tcPr>
+          <w:p>
+            <w:pPr>
+              <w:bidi/>
+              <w:jc w:val="center"/>
+            </w:pPr>
+            <w:r>
+              <w:rPr>
+                <w:rFonts w:ascii="KFGQPC HAFS Uthmanic Script" w:cs="KFGQPC HAFS Uthmanic Script" w:eastAsia="KFGQPC HAFS Uthmanic Script" w:hAnsi="KFGQPC HAFS Uthmanic Script"/>
+                <w:sz w:val="32"/>
+                <w:szCs w:val="32"/>
+                <w:rtl/>
+              </w:rPr>
+              <w:t xml:space="preserve">ع مقدمة</w:t>
+            </w:r>
+          </w:p>
+        </w:tc>
+        <w:tc>
+          <w:tcPr>
+            <w:tcW w:type="dxa" w:w="8060"/>
+          </w:tcPr>
+          <w:p>
+            <w:r>
+              <w:rPr>
+                <w:b w:val="false"/>
+                <w:bCs w:val="false"/>
+                <w:sz w:val="18"/>
+                <w:szCs w:val="18"/>
+              </w:rPr>
+              <w:t xml:space="preserve">This is the letter ʿayn. It looks like a curly seaweed frond — a backwards three. Look — no bubbles at all. ʿayn has no dots.</w:t>
+            </w:r>
+          </w:p>
+        </w:tc>
+        <w:tc>
+          <w:tcPr>
+            <w:tcW w:type="dxa" w:w="3000"/>
+          </w:tcPr>
+          <w:p>
+            <w:pPr>
+              <w:bidi/>
+              <w:jc w:val="center"/>
+            </w:pPr>
+          </w:p>
+        </w:tc>
+      </w:tr>
+      <w:tr>
+        <w:tc>
+          <w:tcPr>
+            <w:tcW w:type="dxa" w:w="1900"/>
+          </w:tcPr>
+          <w:p>
+            <w:pPr>
+              <w:bidi/>
+              <w:jc w:val="center"/>
+            </w:pPr>
+            <w:r>
+              <w:rPr>
+                <w:rFonts w:ascii="KFGQPC HAFS Uthmanic Script" w:cs="KFGQPC HAFS Uthmanic Script" w:eastAsia="KFGQPC HAFS Uthmanic Script" w:hAnsi="KFGQPC HAFS Uthmanic Script"/>
+                <w:sz w:val="32"/>
+                <w:szCs w:val="32"/>
+                <w:rtl/>
+              </w:rPr>
+              <w:t xml:space="preserve">ع حركات</w:t>
+            </w:r>
+          </w:p>
+        </w:tc>
+        <w:tc>
+          <w:tcPr>
+            <w:tcW w:type="dxa" w:w="8060"/>
+          </w:tcPr>
+          <w:p>
+            <w:r>
+              <w:rPr>
+                <w:b w:val="false"/>
+                <w:bCs w:val="false"/>
+                <w:sz w:val="18"/>
+                <w:szCs w:val="18"/>
+              </w:rPr>
+              <w:t xml:space="preserve">With a fatha it's عَ. With a damma it's عُ. With a kasra it's عِ. And with a sukoon after نَ, it's نَعۡ.</w:t>
+            </w:r>
+          </w:p>
+        </w:tc>
+        <w:tc>
+          <w:tcPr>
+            <w:tcW w:type="dxa" w:w="3000"/>
+          </w:tcPr>
+          <w:p>
+            <w:pPr>
+              <w:bidi/>
+              <w:jc w:val="center"/>
+            </w:pPr>
+            <w:r>
+              <w:rPr>
+                <w:rFonts w:ascii="KFGQPC HAFS Uthmanic Script" w:cs="KFGQPC HAFS Uthmanic Script" w:eastAsia="KFGQPC HAFS Uthmanic Script" w:hAnsi="KFGQPC HAFS Uthmanic Script"/>
+                <w:sz w:val="32"/>
+                <w:szCs w:val="32"/>
+                <w:rtl/>
+              </w:rPr>
+              <w:t xml:space="preserve">عَ عُ عِ نَعۡ</w:t>
+            </w:r>
+          </w:p>
+        </w:tc>
+      </w:tr>
+      <w:tr>
+        <w:tc>
+          <w:tcPr>
+            <w:tcW w:type="dxa" w:w="1900"/>
+          </w:tcPr>
+          <w:p>
+            <w:pPr>
+              <w:bidi/>
+              <w:jc w:val="center"/>
+            </w:pPr>
+            <w:r>
+              <w:rPr>
+                <w:rFonts w:ascii="KFGQPC HAFS Uthmanic Script" w:cs="KFGQPC HAFS Uthmanic Script" w:eastAsia="KFGQPC HAFS Uthmanic Script" w:hAnsi="KFGQPC HAFS Uthmanic Script"/>
+                <w:sz w:val="32"/>
+                <w:szCs w:val="32"/>
+                <w:rtl/>
+              </w:rPr>
+              <w:t xml:space="preserve">غ مقدمة</w:t>
+            </w:r>
+          </w:p>
+        </w:tc>
+        <w:tc>
+          <w:tcPr>
+            <w:tcW w:type="dxa" w:w="8060"/>
+          </w:tcPr>
+          <w:p>
+            <w:r>
+              <w:rPr>
+                <w:b w:val="false"/>
+                <w:bCs w:val="false"/>
+                <w:sz w:val="18"/>
+                <w:szCs w:val="18"/>
+              </w:rPr>
+              <w:t xml:space="preserve">This is the letter ghayn. It looks like the same curly frond. Look — one bubble on top. Ghayn has one dot on top.</w:t>
+            </w:r>
+          </w:p>
+        </w:tc>
+        <w:tc>
+          <w:tcPr>
+            <w:tcW w:type="dxa" w:w="3000"/>
+          </w:tcPr>
+          <w:p>
+            <w:pPr>
+              <w:bidi/>
+              <w:jc w:val="center"/>
+            </w:pPr>
+          </w:p>
+        </w:tc>
+      </w:tr>
+      <w:tr>
+        <w:tc>
+          <w:tcPr>
+            <w:tcW w:type="dxa" w:w="1900"/>
+          </w:tcPr>
+          <w:p>
+            <w:pPr>
+              <w:bidi/>
+              <w:jc w:val="center"/>
+            </w:pPr>
+            <w:r>
+              <w:rPr>
+                <w:rFonts w:ascii="KFGQPC HAFS Uthmanic Script" w:cs="KFGQPC HAFS Uthmanic Script" w:eastAsia="KFGQPC HAFS Uthmanic Script" w:hAnsi="KFGQPC HAFS Uthmanic Script"/>
+                <w:sz w:val="32"/>
+                <w:szCs w:val="32"/>
+                <w:rtl/>
+              </w:rPr>
+              <w:t xml:space="preserve">غ حركات</w:t>
+            </w:r>
+          </w:p>
+        </w:tc>
+        <w:tc>
+          <w:tcPr>
+            <w:tcW w:type="dxa" w:w="8060"/>
+          </w:tcPr>
+          <w:p>
+            <w:r>
+              <w:rPr>
+                <w:b w:val="false"/>
+                <w:bCs w:val="false"/>
+                <w:sz w:val="18"/>
+                <w:szCs w:val="18"/>
+              </w:rPr>
+              <w:t xml:space="preserve">With a fatha it's غَ. With a damma it's غُ. With a kasra it's غِ. And with a sukoon after نَ, it's نَغۡ.</w:t>
+            </w:r>
+          </w:p>
+        </w:tc>
+        <w:tc>
+          <w:tcPr>
+            <w:tcW w:type="dxa" w:w="3000"/>
+          </w:tcPr>
+          <w:p>
+            <w:pPr>
+              <w:bidi/>
+              <w:jc w:val="center"/>
+            </w:pPr>
+            <w:r>
+              <w:rPr>
+                <w:rFonts w:ascii="KFGQPC HAFS Uthmanic Script" w:cs="KFGQPC HAFS Uthmanic Script" w:eastAsia="KFGQPC HAFS Uthmanic Script" w:hAnsi="KFGQPC HAFS Uthmanic Script"/>
+                <w:sz w:val="32"/>
+                <w:szCs w:val="32"/>
+                <w:rtl/>
+              </w:rPr>
+              <w:t xml:space="preserve">غَ غُ غِ نَغۡ</w:t>
+            </w:r>
+          </w:p>
+        </w:tc>
+      </w:tr>
+      <w:tr>
+        <w:tc>
+          <w:tcPr>
+            <w:tcW w:type="dxa" w:w="1900"/>
+          </w:tcPr>
+          <w:p>
+            <w:pPr>
+              <w:bidi/>
+              <w:jc w:val="center"/>
+            </w:pPr>
+            <w:r>
+              <w:rPr>
+                <w:rFonts w:ascii="KFGQPC HAFS Uthmanic Script" w:cs="KFGQPC HAFS Uthmanic Script" w:eastAsia="KFGQPC HAFS Uthmanic Script" w:hAnsi="KFGQPC HAFS Uthmanic Script"/>
+                <w:sz w:val="32"/>
+                <w:szCs w:val="32"/>
+                <w:rtl/>
+              </w:rPr>
+              <w:t xml:space="preserve">ف مقدمة</w:t>
+            </w:r>
+          </w:p>
+        </w:tc>
+        <w:tc>
+          <w:tcPr>
+            <w:tcW w:type="dxa" w:w="8060"/>
+          </w:tcPr>
+          <w:p>
+            <w:r>
+              <w:rPr>
+                <w:b w:val="false"/>
+                <w:bCs w:val="false"/>
+                <w:sz w:val="18"/>
+                <w:szCs w:val="18"/>
+              </w:rPr>
+              <w:t xml:space="preserve">This is the letter faa. It looks like a fishing net with a handle. Look — one bubble on top. Faa has one dot on top.</w:t>
+            </w:r>
+          </w:p>
+        </w:tc>
+        <w:tc>
+          <w:tcPr>
+            <w:tcW w:type="dxa" w:w="3000"/>
+          </w:tcPr>
+          <w:p>
+            <w:pPr>
+              <w:bidi/>
+              <w:jc w:val="center"/>
+            </w:pPr>
+          </w:p>
+        </w:tc>
+      </w:tr>
+      <w:tr>
+        <w:tc>
+          <w:tcPr>
+            <w:tcW w:type="dxa" w:w="1900"/>
+          </w:tcPr>
+          <w:p>
+            <w:pPr>
+              <w:bidi/>
+              <w:jc w:val="center"/>
+            </w:pPr>
+            <w:r>
+              <w:rPr>
+                <w:rFonts w:ascii="KFGQPC HAFS Uthmanic Script" w:cs="KFGQPC HAFS Uthmanic Script" w:eastAsia="KFGQPC HAFS Uthmanic Script" w:hAnsi="KFGQPC HAFS Uthmanic Script"/>
+                <w:sz w:val="32"/>
+                <w:szCs w:val="32"/>
+                <w:rtl/>
+              </w:rPr>
+              <w:t xml:space="preserve">ف حركات</w:t>
+            </w:r>
+          </w:p>
+        </w:tc>
+        <w:tc>
+          <w:tcPr>
+            <w:tcW w:type="dxa" w:w="8060"/>
+          </w:tcPr>
+          <w:p>
+            <w:r>
+              <w:rPr>
+                <w:b w:val="false"/>
+                <w:bCs w:val="false"/>
+                <w:sz w:val="18"/>
+                <w:szCs w:val="18"/>
+              </w:rPr>
+              <w:t xml:space="preserve">With a fatha it's فَ. With a damma it's فُ. With a kasra it's فِ. And with a sukoon after نَ, it's نَفۡ.</w:t>
+            </w:r>
+          </w:p>
+        </w:tc>
+        <w:tc>
+          <w:tcPr>
+            <w:tcW w:type="dxa" w:w="3000"/>
+          </w:tcPr>
+          <w:p>
+            <w:pPr>
+              <w:bidi/>
+              <w:jc w:val="center"/>
+            </w:pPr>
+            <w:r>
+              <w:rPr>
+                <w:rFonts w:ascii="KFGQPC HAFS Uthmanic Script" w:cs="KFGQPC HAFS Uthmanic Script" w:eastAsia="KFGQPC HAFS Uthmanic Script" w:hAnsi="KFGQPC HAFS Uthmanic Script"/>
+                <w:sz w:val="32"/>
+                <w:szCs w:val="32"/>
+                <w:rtl/>
+              </w:rPr>
+              <w:t xml:space="preserve">فَ فُ فِ نَفۡ</w:t>
+            </w:r>
+          </w:p>
+        </w:tc>
+      </w:tr>
+      <w:tr>
+        <w:tc>
+          <w:tcPr>
+            <w:tcW w:type="dxa" w:w="1900"/>
+          </w:tcPr>
+          <w:p>
+            <w:pPr>
+              <w:bidi/>
+              <w:jc w:val="center"/>
+            </w:pPr>
+            <w:r>
+              <w:rPr>
+                <w:rFonts w:ascii="KFGQPC HAFS Uthmanic Script" w:cs="KFGQPC HAFS Uthmanic Script" w:eastAsia="KFGQPC HAFS Uthmanic Script" w:hAnsi="KFGQPC HAFS Uthmanic Script"/>
+                <w:sz w:val="32"/>
+                <w:szCs w:val="32"/>
+                <w:rtl/>
+              </w:rPr>
+              <w:t xml:space="preserve">ق مقدمة</w:t>
+            </w:r>
+          </w:p>
+        </w:tc>
+        <w:tc>
+          <w:tcPr>
+            <w:tcW w:type="dxa" w:w="8060"/>
+          </w:tcPr>
+          <w:p>
+            <w:r>
+              <w:rPr>
+                <w:b w:val="false"/>
+                <w:bCs w:val="false"/>
+                <w:sz w:val="18"/>
+                <w:szCs w:val="18"/>
+              </w:rPr>
+              <w:t xml:space="preserve">This is the letter qaaf. It looks like the same net, but deeper. Look — two bubbles on top. Qaaf has two dots on top.</w:t>
+            </w:r>
+          </w:p>
+        </w:tc>
+        <w:tc>
+          <w:tcPr>
+            <w:tcW w:type="dxa" w:w="3000"/>
+          </w:tcPr>
+          <w:p>
+            <w:pPr>
+              <w:bidi/>
+              <w:jc w:val="center"/>
+            </w:pPr>
+          </w:p>
+        </w:tc>
+      </w:tr>
+      <w:tr>
+        <w:tc>
+          <w:tcPr>
+            <w:tcW w:type="dxa" w:w="1900"/>
+          </w:tcPr>
+          <w:p>
+            <w:pPr>
+              <w:bidi/>
+              <w:jc w:val="center"/>
+            </w:pPr>
+            <w:r>
+              <w:rPr>
+                <w:rFonts w:ascii="KFGQPC HAFS Uthmanic Script" w:cs="KFGQPC HAFS Uthmanic Script" w:eastAsia="KFGQPC HAFS Uthmanic Script" w:hAnsi="KFGQPC HAFS Uthmanic Script"/>
+                <w:sz w:val="32"/>
+                <w:szCs w:val="32"/>
+                <w:rtl/>
+              </w:rPr>
+              <w:t xml:space="preserve">ق حركات</w:t>
+            </w:r>
+          </w:p>
+        </w:tc>
+        <w:tc>
+          <w:tcPr>
+            <w:tcW w:type="dxa" w:w="8060"/>
+          </w:tcPr>
+          <w:p>
+            <w:r>
+              <w:rPr>
+                <w:b w:val="false"/>
+                <w:bCs w:val="false"/>
+                <w:sz w:val="18"/>
+                <w:szCs w:val="18"/>
+              </w:rPr>
+              <w:t xml:space="preserve">With a fatha it's قَ. With a damma it's قُ. With a kasra it's قِ. And with a sukoon after نَ, it's نَقۡ.</w:t>
+            </w:r>
+          </w:p>
+        </w:tc>
+        <w:tc>
+          <w:tcPr>
+            <w:tcW w:type="dxa" w:w="3000"/>
+          </w:tcPr>
+          <w:p>
+            <w:pPr>
+              <w:bidi/>
+              <w:jc w:val="center"/>
+            </w:pPr>
+            <w:r>
+              <w:rPr>
+                <w:rFonts w:ascii="KFGQPC HAFS Uthmanic Script" w:cs="KFGQPC HAFS Uthmanic Script" w:eastAsia="KFGQPC HAFS Uthmanic Script" w:hAnsi="KFGQPC HAFS Uthmanic Script"/>
+                <w:sz w:val="32"/>
+                <w:szCs w:val="32"/>
+                <w:rtl/>
+              </w:rPr>
+              <w:t xml:space="preserve">قَ قُ قِ نَقۡ</w:t>
+            </w:r>
+          </w:p>
+        </w:tc>
+      </w:tr>
+      <w:tr>
+        <w:tc>
+          <w:tcPr>
+            <w:tcW w:type="dxa" w:w="1900"/>
+          </w:tcPr>
+          <w:p>
+            <w:pPr>
+              <w:bidi/>
+              <w:jc w:val="center"/>
+            </w:pPr>
+            <w:r>
+              <w:rPr>
+                <w:rFonts w:ascii="KFGQPC HAFS Uthmanic Script" w:cs="KFGQPC HAFS Uthmanic Script" w:eastAsia="KFGQPC HAFS Uthmanic Script" w:hAnsi="KFGQPC HAFS Uthmanic Script"/>
+                <w:sz w:val="32"/>
+                <w:szCs w:val="32"/>
+                <w:rtl/>
+              </w:rPr>
+              <w:t xml:space="preserve">ك مقدمة</w:t>
+            </w:r>
+          </w:p>
+        </w:tc>
+        <w:tc>
+          <w:tcPr>
+            <w:tcW w:type="dxa" w:w="8060"/>
+          </w:tcPr>
+          <w:p>
+            <w:r>
+              <w:rPr>
+                <w:b w:val="false"/>
+                <w:bCs w:val="false"/>
+                <w:sz w:val="18"/>
+                <w:szCs w:val="18"/>
+              </w:rPr>
+              <w:t xml:space="preserve">This is the letter kaaf. It looks like a deck chair with a cushion in it. Look — no bubbles at all. Kaaf has no dots.</w:t>
+            </w:r>
+          </w:p>
+        </w:tc>
+        <w:tc>
+          <w:tcPr>
+            <w:tcW w:type="dxa" w:w="3000"/>
+          </w:tcPr>
+          <w:p>
+            <w:pPr>
+              <w:bidi/>
+              <w:jc w:val="center"/>
+            </w:pPr>
+          </w:p>
+        </w:tc>
+      </w:tr>
+      <w:tr>
+        <w:tc>
+          <w:tcPr>
+            <w:tcW w:type="dxa" w:w="1900"/>
+          </w:tcPr>
+          <w:p>
+            <w:pPr>
+              <w:bidi/>
+              <w:jc w:val="center"/>
+            </w:pPr>
+            <w:r>
+              <w:rPr>
+                <w:rFonts w:ascii="KFGQPC HAFS Uthmanic Script" w:cs="KFGQPC HAFS Uthmanic Script" w:eastAsia="KFGQPC HAFS Uthmanic Script" w:hAnsi="KFGQPC HAFS Uthmanic Script"/>
+                <w:sz w:val="32"/>
+                <w:szCs w:val="32"/>
+                <w:rtl/>
+              </w:rPr>
+              <w:t xml:space="preserve">ك حركات</w:t>
+            </w:r>
+          </w:p>
+        </w:tc>
+        <w:tc>
+          <w:tcPr>
+            <w:tcW w:type="dxa" w:w="8060"/>
+          </w:tcPr>
+          <w:p>
+            <w:r>
+              <w:rPr>
+                <w:b w:val="false"/>
+                <w:bCs w:val="false"/>
+                <w:sz w:val="18"/>
+                <w:szCs w:val="18"/>
+              </w:rPr>
+              <w:t xml:space="preserve">With a fatha it's كَ. With a damma it's كُ. With a kasra it's كِ. And with a sukoon after نَ, it's نَكۡ.</w:t>
+            </w:r>
+          </w:p>
+        </w:tc>
+        <w:tc>
+          <w:tcPr>
+            <w:tcW w:type="dxa" w:w="3000"/>
+          </w:tcPr>
+          <w:p>
+            <w:pPr>
+              <w:bidi/>
+              <w:jc w:val="center"/>
+            </w:pPr>
+            <w:r>
+              <w:rPr>
+                <w:rFonts w:ascii="KFGQPC HAFS Uthmanic Script" w:cs="KFGQPC HAFS Uthmanic Script" w:eastAsia="KFGQPC HAFS Uthmanic Script" w:hAnsi="KFGQPC HAFS Uthmanic Script"/>
+                <w:sz w:val="32"/>
+                <w:szCs w:val="32"/>
+                <w:rtl/>
+              </w:rPr>
+              <w:t xml:space="preserve">كَ كُ كِ نَكۡ</w:t>
+            </w:r>
+          </w:p>
+        </w:tc>
+      </w:tr>
+      <w:tr>
+        <w:tc>
+          <w:tcPr>
+            <w:tcW w:type="dxa" w:w="1900"/>
+          </w:tcPr>
+          <w:p>
+            <w:pPr>
+              <w:bidi/>
+              <w:jc w:val="center"/>
+            </w:pPr>
+            <w:r>
+              <w:rPr>
+                <w:rFonts w:ascii="KFGQPC HAFS Uthmanic Script" w:cs="KFGQPC HAFS Uthmanic Script" w:eastAsia="KFGQPC HAFS Uthmanic Script" w:hAnsi="KFGQPC HAFS Uthmanic Script"/>
+                <w:sz w:val="32"/>
+                <w:szCs w:val="32"/>
+                <w:rtl/>
+              </w:rPr>
+              <w:t xml:space="preserve">ل مقدمة</w:t>
+            </w:r>
+          </w:p>
+        </w:tc>
+        <w:tc>
+          <w:tcPr>
+            <w:tcW w:type="dxa" w:w="8060"/>
+          </w:tcPr>
+          <w:p>
+            <w:r>
+              <w:rPr>
+                <w:b w:val="false"/>
+                <w:bCs w:val="false"/>
+                <w:sz w:val="18"/>
+                <w:szCs w:val="18"/>
+              </w:rPr>
+              <w:t xml:space="preserve">This is the letter laam. It looks like a snorkel. Look — no bubbles at all. Laam has no dots.</w:t>
+            </w:r>
+          </w:p>
+        </w:tc>
+        <w:tc>
+          <w:tcPr>
+            <w:tcW w:type="dxa" w:w="3000"/>
+          </w:tcPr>
+          <w:p>
+            <w:pPr>
+              <w:bidi/>
+              <w:jc w:val="center"/>
+            </w:pPr>
+          </w:p>
+        </w:tc>
+      </w:tr>
+      <w:tr>
+        <w:tc>
+          <w:tcPr>
+            <w:tcW w:type="dxa" w:w="1900"/>
+          </w:tcPr>
+          <w:p>
+            <w:pPr>
+              <w:bidi/>
+              <w:jc w:val="center"/>
+            </w:pPr>
+            <w:r>
+              <w:rPr>
+                <w:rFonts w:ascii="KFGQPC HAFS Uthmanic Script" w:cs="KFGQPC HAFS Uthmanic Script" w:eastAsia="KFGQPC HAFS Uthmanic Script" w:hAnsi="KFGQPC HAFS Uthmanic Script"/>
+                <w:sz w:val="32"/>
+                <w:szCs w:val="32"/>
+                <w:rtl/>
+              </w:rPr>
+              <w:t xml:space="preserve">ل حركات</w:t>
+            </w:r>
+          </w:p>
+        </w:tc>
+        <w:tc>
+          <w:tcPr>
+            <w:tcW w:type="dxa" w:w="8060"/>
+          </w:tcPr>
+          <w:p>
+            <w:r>
+              <w:rPr>
+                <w:b w:val="false"/>
+                <w:bCs w:val="false"/>
+                <w:sz w:val="18"/>
+                <w:szCs w:val="18"/>
+              </w:rPr>
+              <w:t xml:space="preserve">With a fatha it's لَ. With a damma it's لُ. With a kasra it's لِ. And with a sukoon after نَ, it's نَلۡ.</w:t>
+            </w:r>
+          </w:p>
+        </w:tc>
+        <w:tc>
+          <w:tcPr>
+            <w:tcW w:type="dxa" w:w="3000"/>
+          </w:tcPr>
+          <w:p>
+            <w:pPr>
+              <w:bidi/>
+              <w:jc w:val="center"/>
+            </w:pPr>
+            <w:r>
+              <w:rPr>
+                <w:rFonts w:ascii="KFGQPC HAFS Uthmanic Script" w:cs="KFGQPC HAFS Uthmanic Script" w:eastAsia="KFGQPC HAFS Uthmanic Script" w:hAnsi="KFGQPC HAFS Uthmanic Script"/>
+                <w:sz w:val="32"/>
+                <w:szCs w:val="32"/>
+                <w:rtl/>
+              </w:rPr>
+              <w:t xml:space="preserve">لَ لُ لِ نَلۡ</w:t>
+            </w:r>
+          </w:p>
+        </w:tc>
+      </w:tr>
+      <w:tr>
+        <w:tc>
+          <w:tcPr>
+            <w:tcW w:type="dxa" w:w="1900"/>
+          </w:tcPr>
+          <w:p>
+            <w:pPr>
+              <w:bidi/>
+              <w:jc w:val="center"/>
+            </w:pPr>
+            <w:r>
+              <w:rPr>
+                <w:rFonts w:ascii="KFGQPC HAFS Uthmanic Script" w:cs="KFGQPC HAFS Uthmanic Script" w:eastAsia="KFGQPC HAFS Uthmanic Script" w:hAnsi="KFGQPC HAFS Uthmanic Script"/>
+                <w:sz w:val="32"/>
+                <w:szCs w:val="32"/>
+                <w:rtl/>
+              </w:rPr>
+              <w:t xml:space="preserve">م مقدمة</w:t>
+            </w:r>
+          </w:p>
+        </w:tc>
+        <w:tc>
+          <w:tcPr>
+            <w:tcW w:type="dxa" w:w="8060"/>
+          </w:tcPr>
+          <w:p>
+            <w:r>
+              <w:rPr>
+                <w:b w:val="false"/>
+                <w:bCs w:val="false"/>
+                <w:sz w:val="18"/>
+                <w:szCs w:val="18"/>
+              </w:rPr>
+              <w:t xml:space="preserve">This is the letter meem. It looks like a buoy with its rope hanging straight down. Look — no bubbles at all. Meem has no dots.</w:t>
+            </w:r>
+          </w:p>
+        </w:tc>
+        <w:tc>
+          <w:tcPr>
+            <w:tcW w:type="dxa" w:w="3000"/>
+          </w:tcPr>
+          <w:p>
+            <w:pPr>
+              <w:bidi/>
+              <w:jc w:val="center"/>
+            </w:pPr>
+          </w:p>
+        </w:tc>
+      </w:tr>
+      <w:tr>
+        <w:tc>
+          <w:tcPr>
+            <w:tcW w:type="dxa" w:w="1900"/>
+          </w:tcPr>
+          <w:p>
+            <w:pPr>
+              <w:bidi/>
+              <w:jc w:val="center"/>
+            </w:pPr>
+            <w:r>
+              <w:rPr>
+                <w:rFonts w:ascii="KFGQPC HAFS Uthmanic Script" w:cs="KFGQPC HAFS Uthmanic Script" w:eastAsia="KFGQPC HAFS Uthmanic Script" w:hAnsi="KFGQPC HAFS Uthmanic Script"/>
+                <w:sz w:val="32"/>
+                <w:szCs w:val="32"/>
+                <w:rtl/>
+              </w:rPr>
+              <w:t xml:space="preserve">م حركات</w:t>
+            </w:r>
+          </w:p>
+        </w:tc>
+        <w:tc>
+          <w:tcPr>
+            <w:tcW w:type="dxa" w:w="8060"/>
+          </w:tcPr>
+          <w:p>
+            <w:r>
+              <w:rPr>
+                <w:b w:val="false"/>
+                <w:bCs w:val="false"/>
+                <w:sz w:val="18"/>
+                <w:szCs w:val="18"/>
+              </w:rPr>
+              <w:t xml:space="preserve">With a fatha it's مَ. With a damma it's مُ. With a kasra it's مِ. And with a sukoon after نَ, it's نَمۡ.</w:t>
+            </w:r>
+          </w:p>
+        </w:tc>
+        <w:tc>
+          <w:tcPr>
+            <w:tcW w:type="dxa" w:w="3000"/>
+          </w:tcPr>
+          <w:p>
+            <w:pPr>
+              <w:bidi/>
+              <w:jc w:val="center"/>
+            </w:pPr>
+            <w:r>
+              <w:rPr>
+                <w:rFonts w:ascii="KFGQPC HAFS Uthmanic Script" w:cs="KFGQPC HAFS Uthmanic Script" w:eastAsia="KFGQPC HAFS Uthmanic Script" w:hAnsi="KFGQPC HAFS Uthmanic Script"/>
+                <w:sz w:val="32"/>
+                <w:szCs w:val="32"/>
+                <w:rtl/>
+              </w:rPr>
+              <w:t xml:space="preserve">مَ مُ مِ نَمۡ</w:t>
+            </w:r>
+          </w:p>
+        </w:tc>
+      </w:tr>
+      <w:tr>
+        <w:tc>
+          <w:tcPr>
+            <w:tcW w:type="dxa" w:w="1900"/>
+          </w:tcPr>
+          <w:p>
+            <w:pPr>
+              <w:bidi/>
+              <w:jc w:val="center"/>
+            </w:pPr>
+            <w:r>
+              <w:rPr>
+                <w:rFonts w:ascii="KFGQPC HAFS Uthmanic Script" w:cs="KFGQPC HAFS Uthmanic Script" w:eastAsia="KFGQPC HAFS Uthmanic Script" w:hAnsi="KFGQPC HAFS Uthmanic Script"/>
+                <w:sz w:val="32"/>
+                <w:szCs w:val="32"/>
+                <w:rtl/>
+              </w:rPr>
+              <w:t xml:space="preserve">ن مقدمة</w:t>
+            </w:r>
+          </w:p>
+        </w:tc>
+        <w:tc>
+          <w:tcPr>
+            <w:tcW w:type="dxa" w:w="8060"/>
+          </w:tcPr>
+          <w:p>
+            <w:r>
+              <w:rPr>
+                <w:b w:val="false"/>
+                <w:bCs w:val="false"/>
+                <w:sz w:val="18"/>
+                <w:szCs w:val="18"/>
+              </w:rPr>
+              <w:t xml:space="preserve">This is the letter noon. It looks like a round bowl. Look — one bubble on top. Noon has one dot on top.</w:t>
+            </w:r>
+          </w:p>
+        </w:tc>
+        <w:tc>
+          <w:tcPr>
+            <w:tcW w:type="dxa" w:w="3000"/>
+          </w:tcPr>
+          <w:p>
+            <w:pPr>
+              <w:bidi/>
+              <w:jc w:val="center"/>
+            </w:pPr>
+          </w:p>
+        </w:tc>
+      </w:tr>
+      <w:tr>
+        <w:tc>
+          <w:tcPr>
+            <w:tcW w:type="dxa" w:w="1900"/>
+          </w:tcPr>
+          <w:p>
+            <w:pPr>
+              <w:bidi/>
+              <w:jc w:val="center"/>
+            </w:pPr>
+            <w:r>
+              <w:rPr>
+                <w:rFonts w:ascii="KFGQPC HAFS Uthmanic Script" w:cs="KFGQPC HAFS Uthmanic Script" w:eastAsia="KFGQPC HAFS Uthmanic Script" w:hAnsi="KFGQPC HAFS Uthmanic Script"/>
+                <w:sz w:val="32"/>
+                <w:szCs w:val="32"/>
+                <w:rtl/>
+              </w:rPr>
+              <w:t xml:space="preserve">ن حركات</w:t>
+            </w:r>
+          </w:p>
+        </w:tc>
+        <w:tc>
+          <w:tcPr>
+            <w:tcW w:type="dxa" w:w="8060"/>
+          </w:tcPr>
+          <w:p>
+            <w:r>
+              <w:rPr>
+                <w:b w:val="false"/>
+                <w:bCs w:val="false"/>
+                <w:sz w:val="18"/>
+                <w:szCs w:val="18"/>
+              </w:rPr>
+              <w:t xml:space="preserve">With a fatha it's نَ. With a damma it's نُ. With a kasra it's نِ. And with a sukoon after نَ, it's نَنۡ.</w:t>
+            </w:r>
+          </w:p>
+        </w:tc>
+        <w:tc>
+          <w:tcPr>
+            <w:tcW w:type="dxa" w:w="3000"/>
+          </w:tcPr>
+          <w:p>
+            <w:pPr>
+              <w:bidi/>
+              <w:jc w:val="center"/>
+            </w:pPr>
+            <w:r>
+              <w:rPr>
+                <w:rFonts w:ascii="KFGQPC HAFS Uthmanic Script" w:cs="KFGQPC HAFS Uthmanic Script" w:eastAsia="KFGQPC HAFS Uthmanic Script" w:hAnsi="KFGQPC HAFS Uthmanic Script"/>
+                <w:sz w:val="32"/>
+                <w:szCs w:val="32"/>
+                <w:rtl/>
+              </w:rPr>
+              <w:t xml:space="preserve">نَ نُ نِ نَنۡ</w:t>
+            </w:r>
+          </w:p>
+        </w:tc>
+      </w:tr>
+      <w:tr>
+        <w:tc>
+          <w:tcPr>
+            <w:tcW w:type="dxa" w:w="1900"/>
+          </w:tcPr>
+          <w:p>
+            <w:pPr>
+              <w:bidi/>
+              <w:jc w:val="center"/>
+            </w:pPr>
+            <w:r>
+              <w:rPr>
+                <w:rFonts w:ascii="KFGQPC HAFS Uthmanic Script" w:cs="KFGQPC HAFS Uthmanic Script" w:eastAsia="KFGQPC HAFS Uthmanic Script" w:hAnsi="KFGQPC HAFS Uthmanic Script"/>
+                <w:sz w:val="32"/>
+                <w:szCs w:val="32"/>
+                <w:rtl/>
+              </w:rPr>
+              <w:t xml:space="preserve">ه مقدمة</w:t>
+            </w:r>
+          </w:p>
+        </w:tc>
+        <w:tc>
+          <w:tcPr>
+            <w:tcW w:type="dxa" w:w="8060"/>
+          </w:tcPr>
+          <w:p>
+            <w:r>
+              <w:rPr>
+                <w:b w:val="false"/>
+                <w:bCs w:val="false"/>
+                <w:sz w:val="18"/>
+                <w:szCs w:val="18"/>
+              </w:rPr>
+              <w:t xml:space="preserve">This is the letter haa. It looks like a knot in a rope. Look — no bubbles at all. Haa has no dots.</w:t>
+            </w:r>
+          </w:p>
+        </w:tc>
+        <w:tc>
+          <w:tcPr>
+            <w:tcW w:type="dxa" w:w="3000"/>
+          </w:tcPr>
+          <w:p>
+            <w:pPr>
+              <w:bidi/>
+              <w:jc w:val="center"/>
+            </w:pPr>
+          </w:p>
+        </w:tc>
+      </w:tr>
+      <w:tr>
+        <w:tc>
+          <w:tcPr>
+            <w:tcW w:type="dxa" w:w="1900"/>
+          </w:tcPr>
+          <w:p>
+            <w:pPr>
+              <w:bidi/>
+              <w:jc w:val="center"/>
+            </w:pPr>
+            <w:r>
+              <w:rPr>
+                <w:rFonts w:ascii="KFGQPC HAFS Uthmanic Script" w:cs="KFGQPC HAFS Uthmanic Script" w:eastAsia="KFGQPC HAFS Uthmanic Script" w:hAnsi="KFGQPC HAFS Uthmanic Script"/>
+                <w:sz w:val="32"/>
+                <w:szCs w:val="32"/>
+                <w:rtl/>
+              </w:rPr>
+              <w:t xml:space="preserve">ه حركات</w:t>
+            </w:r>
+          </w:p>
+        </w:tc>
+        <w:tc>
+          <w:tcPr>
+            <w:tcW w:type="dxa" w:w="8060"/>
+          </w:tcPr>
+          <w:p>
+            <w:r>
+              <w:rPr>
+                <w:b w:val="false"/>
+                <w:bCs w:val="false"/>
+                <w:sz w:val="18"/>
+                <w:szCs w:val="18"/>
+              </w:rPr>
+              <w:t xml:space="preserve">With a fatha it's هَـ. With a damma it's هُـ. With a kasra it's هِـ. And with a sukoon after نَ, it's نَهۡ.</w:t>
+            </w:r>
+          </w:p>
+        </w:tc>
+        <w:tc>
+          <w:tcPr>
+            <w:tcW w:type="dxa" w:w="3000"/>
+          </w:tcPr>
+          <w:p>
+            <w:pPr>
+              <w:bidi/>
+              <w:jc w:val="center"/>
+            </w:pPr>
+            <w:r>
+              <w:rPr>
+                <w:rFonts w:ascii="KFGQPC HAFS Uthmanic Script" w:cs="KFGQPC HAFS Uthmanic Script" w:eastAsia="KFGQPC HAFS Uthmanic Script" w:hAnsi="KFGQPC HAFS Uthmanic Script"/>
+                <w:sz w:val="32"/>
+                <w:szCs w:val="32"/>
+                <w:rtl/>
+              </w:rPr>
+              <w:t xml:space="preserve">هَـ هُـ هِـ نَهۡ</w:t>
+            </w:r>
+          </w:p>
+        </w:tc>
+      </w:tr>
+      <w:tr>
+        <w:tc>
+          <w:tcPr>
+            <w:tcW w:type="dxa" w:w="1900"/>
+          </w:tcPr>
+          <w:p>
+            <w:pPr>
+              <w:bidi/>
+              <w:jc w:val="center"/>
+            </w:pPr>
+            <w:r>
+              <w:rPr>
+                <w:rFonts w:ascii="KFGQPC HAFS Uthmanic Script" w:cs="KFGQPC HAFS Uthmanic Script" w:eastAsia="KFGQPC HAFS Uthmanic Script" w:hAnsi="KFGQPC HAFS Uthmanic Script"/>
+                <w:sz w:val="32"/>
+                <w:szCs w:val="32"/>
+                <w:rtl/>
+              </w:rPr>
+              <w:t xml:space="preserve">أ مقدمة</w:t>
+            </w:r>
+          </w:p>
+        </w:tc>
+        <w:tc>
+          <w:tcPr>
+            <w:tcW w:type="dxa" w:w="8060"/>
+          </w:tcPr>
+          <w:p>
+            <w:r>
+              <w:rPr>
+                <w:b w:val="false"/>
+                <w:bCs w:val="false"/>
+                <w:sz w:val="18"/>
+                <w:szCs w:val="18"/>
+              </w:rPr>
+              <w:t xml:space="preserve">This is the hamza. It looks like a little wave curling over. The hamza likes to sit on other letters — here it is sitting on an alif. The hamza has no dots.</w:t>
+            </w:r>
+          </w:p>
+        </w:tc>
+        <w:tc>
+          <w:tcPr>
+            <w:tcW w:type="dxa" w:w="3000"/>
+          </w:tcPr>
+          <w:p>
+            <w:pPr>
+              <w:bidi/>
+              <w:jc w:val="center"/>
+            </w:pPr>
+          </w:p>
+        </w:tc>
+      </w:tr>
+      <w:tr>
+        <w:tc>
+          <w:tcPr>
+            <w:tcW w:type="dxa" w:w="1900"/>
+          </w:tcPr>
+          <w:p>
+            <w:pPr>
+              <w:bidi/>
+              <w:jc w:val="center"/>
+            </w:pPr>
+            <w:r>
+              <w:rPr>
+                <w:rFonts w:ascii="KFGQPC HAFS Uthmanic Script" w:cs="KFGQPC HAFS Uthmanic Script" w:eastAsia="KFGQPC HAFS Uthmanic Script" w:hAnsi="KFGQPC HAFS Uthmanic Script"/>
+                <w:sz w:val="32"/>
+                <w:szCs w:val="32"/>
+                <w:rtl/>
+              </w:rPr>
+              <w:t xml:space="preserve">أ حركات</w:t>
+            </w:r>
+          </w:p>
+        </w:tc>
+        <w:tc>
+          <w:tcPr>
+            <w:tcW w:type="dxa" w:w="8060"/>
+          </w:tcPr>
+          <w:p>
+            <w:r>
+              <w:rPr>
+                <w:b w:val="false"/>
+                <w:bCs w:val="false"/>
+                <w:sz w:val="18"/>
+                <w:szCs w:val="18"/>
+              </w:rPr>
+              <w:t xml:space="preserve">With a fatha it's أَ. With a damma it's أُ. With a kasra it sits under the alif — إِ. And with a sukoon after نَ, it's نَأۡ.</w:t>
+            </w:r>
+          </w:p>
+        </w:tc>
+        <w:tc>
+          <w:tcPr>
+            <w:tcW w:type="dxa" w:w="3000"/>
+          </w:tcPr>
+          <w:p>
+            <w:pPr>
+              <w:bidi/>
+              <w:jc w:val="center"/>
+            </w:pPr>
+            <w:r>
+              <w:rPr>
+                <w:rFonts w:ascii="KFGQPC HAFS Uthmanic Script" w:cs="KFGQPC HAFS Uthmanic Script" w:eastAsia="KFGQPC HAFS Uthmanic Script" w:hAnsi="KFGQPC HAFS Uthmanic Script"/>
+                <w:sz w:val="32"/>
+                <w:szCs w:val="32"/>
+                <w:rtl/>
+              </w:rPr>
+              <w:t xml:space="preserve">أَ أُ إِ نَأۡ</w:t>
+            </w:r>
+          </w:p>
+        </w:tc>
+      </w:tr>
+      <w:tr>
+        <w:tc>
+          <w:tcPr>
+            <w:tcW w:type="dxa" w:w="1900"/>
+          </w:tcPr>
+          <w:p>
+            <w:pPr>
+              <w:bidi/>
+              <w:jc w:val="center"/>
+            </w:pPr>
+            <w:r>
+              <w:rPr>
+                <w:rFonts w:ascii="KFGQPC HAFS Uthmanic Script" w:cs="KFGQPC HAFS Uthmanic Script" w:eastAsia="KFGQPC HAFS Uthmanic Script" w:hAnsi="KFGQPC HAFS Uthmanic Script"/>
+                <w:sz w:val="32"/>
+                <w:szCs w:val="32"/>
+                <w:rtl/>
+              </w:rPr>
+              <w:t xml:space="preserve">ؤ مقدمة</w:t>
+            </w:r>
+          </w:p>
+        </w:tc>
+        <w:tc>
+          <w:tcPr>
+            <w:tcW w:type="dxa" w:w="8060"/>
+          </w:tcPr>
+          <w:p>
+            <w:r>
+              <w:rPr>
+                <w:b w:val="false"/>
+                <w:bCs w:val="false"/>
+                <w:sz w:val="18"/>
+                <w:szCs w:val="18"/>
+              </w:rPr>
+              <w:t xml:space="preserve">Here the hamza is sitting on a waw.</w:t>
+            </w:r>
+          </w:p>
+        </w:tc>
+        <w:tc>
+          <w:tcPr>
+            <w:tcW w:type="dxa" w:w="3000"/>
+          </w:tcPr>
+          <w:p>
+            <w:pPr>
+              <w:bidi/>
+              <w:jc w:val="center"/>
+            </w:pPr>
+          </w:p>
+        </w:tc>
+      </w:tr>
+      <w:tr>
+        <w:tc>
+          <w:tcPr>
+            <w:tcW w:type="dxa" w:w="1900"/>
+          </w:tcPr>
+          <w:p>
+            <w:pPr>
+              <w:bidi/>
+              <w:jc w:val="center"/>
+            </w:pPr>
+            <w:r>
+              <w:rPr>
+                <w:rFonts w:ascii="KFGQPC HAFS Uthmanic Script" w:cs="KFGQPC HAFS Uthmanic Script" w:eastAsia="KFGQPC HAFS Uthmanic Script" w:hAnsi="KFGQPC HAFS Uthmanic Script"/>
+                <w:sz w:val="32"/>
+                <w:szCs w:val="32"/>
+                <w:rtl/>
+              </w:rPr>
+              <w:t xml:space="preserve">ؤ حركات</w:t>
+            </w:r>
+          </w:p>
+        </w:tc>
+        <w:tc>
+          <w:tcPr>
+            <w:tcW w:type="dxa" w:w="8060"/>
+          </w:tcPr>
+          <w:p>
+            <w:r>
+              <w:rPr>
+                <w:b w:val="false"/>
+                <w:bCs w:val="false"/>
+                <w:sz w:val="18"/>
+                <w:szCs w:val="18"/>
+              </w:rPr>
+              <w:t xml:space="preserve">Listen: مُؤۡمِن.</w:t>
+            </w:r>
+          </w:p>
+        </w:tc>
+        <w:tc>
+          <w:tcPr>
+            <w:tcW w:type="dxa" w:w="3000"/>
+          </w:tcPr>
+          <w:p>
+            <w:pPr>
+              <w:bidi/>
+              <w:jc w:val="center"/>
+            </w:pPr>
+            <w:r>
+              <w:rPr>
+                <w:rFonts w:ascii="KFGQPC HAFS Uthmanic Script" w:cs="KFGQPC HAFS Uthmanic Script" w:eastAsia="KFGQPC HAFS Uthmanic Script" w:hAnsi="KFGQPC HAFS Uthmanic Script"/>
+                <w:sz w:val="32"/>
+                <w:szCs w:val="32"/>
+                <w:rtl/>
+              </w:rPr>
+              <w:t xml:space="preserve">مُؤۡمِن</w:t>
+            </w:r>
+          </w:p>
+        </w:tc>
+      </w:tr>
+      <w:tr>
+        <w:tc>
+          <w:tcPr>
+            <w:tcW w:type="dxa" w:w="1900"/>
+          </w:tcPr>
+          <w:p>
+            <w:pPr>
+              <w:bidi/>
+              <w:jc w:val="center"/>
+            </w:pPr>
+            <w:r>
+              <w:rPr>
+                <w:rFonts w:ascii="KFGQPC HAFS Uthmanic Script" w:cs="KFGQPC HAFS Uthmanic Script" w:eastAsia="KFGQPC HAFS Uthmanic Script" w:hAnsi="KFGQPC HAFS Uthmanic Script"/>
+                <w:sz w:val="32"/>
+                <w:szCs w:val="32"/>
+                <w:rtl/>
+              </w:rPr>
+              <w:t xml:space="preserve">ئ مقدمة</w:t>
+            </w:r>
+          </w:p>
+        </w:tc>
+        <w:tc>
+          <w:tcPr>
+            <w:tcW w:type="dxa" w:w="8060"/>
+          </w:tcPr>
+          <w:p>
+            <w:r>
+              <w:rPr>
+                <w:b w:val="false"/>
+                <w:bCs w:val="false"/>
+                <w:sz w:val="18"/>
+                <w:szCs w:val="18"/>
+              </w:rPr>
+              <w:t xml:space="preserve">Here the hamza is sitting on a yaa.</w:t>
+            </w:r>
+          </w:p>
+        </w:tc>
+        <w:tc>
+          <w:tcPr>
+            <w:tcW w:type="dxa" w:w="3000"/>
+          </w:tcPr>
+          <w:p>
+            <w:pPr>
+              <w:bidi/>
+              <w:jc w:val="center"/>
+            </w:pPr>
+          </w:p>
+        </w:tc>
+      </w:tr>
+      <w:tr>
+        <w:tc>
+          <w:tcPr>
+            <w:tcW w:type="dxa" w:w="1900"/>
+          </w:tcPr>
+          <w:p>
+            <w:pPr>
+              <w:bidi/>
+              <w:jc w:val="center"/>
+            </w:pPr>
+            <w:r>
+              <w:rPr>
+                <w:rFonts w:ascii="KFGQPC HAFS Uthmanic Script" w:cs="KFGQPC HAFS Uthmanic Script" w:eastAsia="KFGQPC HAFS Uthmanic Script" w:hAnsi="KFGQPC HAFS Uthmanic Script"/>
+                <w:sz w:val="32"/>
+                <w:szCs w:val="32"/>
+                <w:rtl/>
+              </w:rPr>
+              <w:t xml:space="preserve">ئ حركات</w:t>
+            </w:r>
+          </w:p>
+        </w:tc>
+        <w:tc>
+          <w:tcPr>
+            <w:tcW w:type="dxa" w:w="8060"/>
+          </w:tcPr>
+          <w:p>
+            <w:r>
+              <w:rPr>
+                <w:b w:val="false"/>
+                <w:bCs w:val="false"/>
+                <w:sz w:val="18"/>
+                <w:szCs w:val="18"/>
+              </w:rPr>
+              <w:t xml:space="preserve">Listen: سُئِلَ.</w:t>
+            </w:r>
+          </w:p>
+        </w:tc>
+        <w:tc>
+          <w:tcPr>
+            <w:tcW w:type="dxa" w:w="3000"/>
+          </w:tcPr>
+          <w:p>
+            <w:pPr>
+              <w:bidi/>
+              <w:jc w:val="center"/>
+            </w:pPr>
+            <w:r>
+              <w:rPr>
+                <w:rFonts w:ascii="KFGQPC HAFS Uthmanic Script" w:cs="KFGQPC HAFS Uthmanic Script" w:eastAsia="KFGQPC HAFS Uthmanic Script" w:hAnsi="KFGQPC HAFS Uthmanic Script"/>
+                <w:sz w:val="32"/>
+                <w:szCs w:val="32"/>
+                <w:rtl/>
+              </w:rPr>
+              <w:t xml:space="preserve">سُئِلَ</w:t>
+            </w:r>
+          </w:p>
+        </w:tc>
+      </w:tr>
+      <w:tr>
+        <w:tc>
+          <w:tcPr>
+            <w:tcW w:type="dxa" w:w="1900"/>
+          </w:tcPr>
+          <w:p>
+            <w:pPr>
+              <w:bidi/>
+              <w:jc w:val="center"/>
+            </w:pPr>
+            <w:r>
+              <w:rPr>
+                <w:rFonts w:ascii="KFGQPC HAFS Uthmanic Script" w:cs="KFGQPC HAFS Uthmanic Script" w:eastAsia="KFGQPC HAFS Uthmanic Script" w:hAnsi="KFGQPC HAFS Uthmanic Script"/>
+                <w:sz w:val="32"/>
+                <w:szCs w:val="32"/>
+                <w:rtl/>
+              </w:rPr>
+              <w:t xml:space="preserve">ء مقدمة</w:t>
+            </w:r>
+          </w:p>
+        </w:tc>
+        <w:tc>
+          <w:tcPr>
+            <w:tcW w:type="dxa" w:w="8060"/>
+          </w:tcPr>
+          <w:p>
+            <w:r>
+              <w:rPr>
+                <w:b w:val="false"/>
+                <w:bCs w:val="false"/>
+                <w:sz w:val="18"/>
+                <w:szCs w:val="18"/>
+              </w:rPr>
+              <w:t xml:space="preserve">And here the hamza sits on nothing at all — all by itself on the sand.</w:t>
+            </w:r>
+          </w:p>
+        </w:tc>
+        <w:tc>
+          <w:tcPr>
+            <w:tcW w:type="dxa" w:w="3000"/>
+          </w:tcPr>
+          <w:p>
+            <w:pPr>
+              <w:bidi/>
+              <w:jc w:val="center"/>
+            </w:pPr>
+          </w:p>
+        </w:tc>
+      </w:tr>
+      <w:tr>
+        <w:tc>
+          <w:tcPr>
+            <w:tcW w:type="dxa" w:w="1900"/>
+          </w:tcPr>
+          <w:p>
+            <w:pPr>
+              <w:bidi/>
+              <w:jc w:val="center"/>
+            </w:pPr>
+            <w:r>
+              <w:rPr>
+                <w:rFonts w:ascii="KFGQPC HAFS Uthmanic Script" w:cs="KFGQPC HAFS Uthmanic Script" w:eastAsia="KFGQPC HAFS Uthmanic Script" w:hAnsi="KFGQPC HAFS Uthmanic Script"/>
+                <w:sz w:val="32"/>
+                <w:szCs w:val="32"/>
+                <w:rtl/>
+              </w:rPr>
+              <w:t xml:space="preserve">ء حركات</w:t>
+            </w:r>
+          </w:p>
+        </w:tc>
+        <w:tc>
+          <w:tcPr>
+            <w:tcW w:type="dxa" w:w="8060"/>
+          </w:tcPr>
+          <w:p>
+            <w:r>
+              <w:rPr>
+                <w:b w:val="false"/>
+                <w:bCs w:val="false"/>
+                <w:sz w:val="18"/>
+                <w:szCs w:val="18"/>
+              </w:rPr>
+              <w:t xml:space="preserve">Listen: جُزۡء.</w:t>
+            </w:r>
+          </w:p>
+        </w:tc>
+        <w:tc>
+          <w:tcPr>
+            <w:tcW w:type="dxa" w:w="3000"/>
+          </w:tcPr>
+          <w:p>
+            <w:pPr>
+              <w:bidi/>
+              <w:jc w:val="center"/>
+            </w:pPr>
+            <w:r>
+              <w:rPr>
+                <w:rFonts w:ascii="KFGQPC HAFS Uthmanic Script" w:cs="KFGQPC HAFS Uthmanic Script" w:eastAsia="KFGQPC HAFS Uthmanic Script" w:hAnsi="KFGQPC HAFS Uthmanic Script"/>
+                <w:sz w:val="32"/>
+                <w:szCs w:val="32"/>
+                <w:rtl/>
+              </w:rPr>
+              <w:t xml:space="preserve">جُزۡء</w:t>
+            </w:r>
+          </w:p>
+        </w:tc>
+      </w:tr>
+      <w:tr>
+        <w:tc>
+          <w:tcPr>
+            <w:tcW w:type="dxa" w:w="1900"/>
+          </w:tcPr>
+          <w:p>
+            <w:pPr>
+              <w:bidi/>
+              <w:jc w:val="center"/>
+            </w:pPr>
+            <w:r>
+              <w:rPr>
+                <w:rFonts w:ascii="KFGQPC HAFS Uthmanic Script" w:cs="KFGQPC HAFS Uthmanic Script" w:eastAsia="KFGQPC HAFS Uthmanic Script" w:hAnsi="KFGQPC HAFS Uthmanic Script"/>
+                <w:sz w:val="32"/>
+                <w:szCs w:val="32"/>
+                <w:rtl/>
+              </w:rPr>
+              <w:t xml:space="preserve">و مقدمة</w:t>
+            </w:r>
+          </w:p>
+        </w:tc>
+        <w:tc>
+          <w:tcPr>
+            <w:tcW w:type="dxa" w:w="8060"/>
+          </w:tcPr>
+          <w:p>
+            <w:r>
+              <w:rPr>
+                <w:b w:val="false"/>
+                <w:bCs w:val="false"/>
+                <w:sz w:val="18"/>
+                <w:szCs w:val="18"/>
+              </w:rPr>
+              <w:t xml:space="preserve">This is the letter waw. It looks like a tadpole — a round body with a tail sweeping to the side. Waw has no dots.</w:t>
+            </w:r>
+          </w:p>
+        </w:tc>
+        <w:tc>
+          <w:tcPr>
+            <w:tcW w:type="dxa" w:w="3000"/>
+          </w:tcPr>
+          <w:p>
+            <w:pPr>
+              <w:bidi/>
+              <w:jc w:val="center"/>
+            </w:pPr>
+          </w:p>
+        </w:tc>
+      </w:tr>
+      <w:tr>
+        <w:tc>
+          <w:tcPr>
+            <w:tcW w:type="dxa" w:w="1900"/>
+          </w:tcPr>
+          <w:p>
+            <w:pPr>
+              <w:bidi/>
+              <w:jc w:val="center"/>
+            </w:pPr>
+            <w:r>
+              <w:rPr>
+                <w:rFonts w:ascii="KFGQPC HAFS Uthmanic Script" w:cs="KFGQPC HAFS Uthmanic Script" w:eastAsia="KFGQPC HAFS Uthmanic Script" w:hAnsi="KFGQPC HAFS Uthmanic Script"/>
+                <w:sz w:val="32"/>
+                <w:szCs w:val="32"/>
+                <w:rtl/>
+              </w:rPr>
+              <w:t xml:space="preserve">و حركات</w:t>
+            </w:r>
+          </w:p>
+        </w:tc>
+        <w:tc>
+          <w:tcPr>
+            <w:tcW w:type="dxa" w:w="8060"/>
+          </w:tcPr>
+          <w:p>
+            <w:r>
+              <w:rPr>
+                <w:b w:val="false"/>
+                <w:bCs w:val="false"/>
+                <w:sz w:val="18"/>
+                <w:szCs w:val="18"/>
+              </w:rPr>
+              <w:t xml:space="preserve">With a fatha it's وَ. With a damma it's وُ. With a kasra it's وِ. After نَ with a sukoon it's نَوۡ. And after نُ it stretches — نُو.</w:t>
+            </w:r>
+          </w:p>
+        </w:tc>
+        <w:tc>
+          <w:tcPr>
+            <w:tcW w:type="dxa" w:w="3000"/>
+          </w:tcPr>
+          <w:p>
+            <w:pPr>
+              <w:bidi/>
+              <w:jc w:val="center"/>
+            </w:pPr>
+            <w:r>
+              <w:rPr>
+                <w:rFonts w:ascii="KFGQPC HAFS Uthmanic Script" w:cs="KFGQPC HAFS Uthmanic Script" w:eastAsia="KFGQPC HAFS Uthmanic Script" w:hAnsi="KFGQPC HAFS Uthmanic Script"/>
+                <w:sz w:val="32"/>
+                <w:szCs w:val="32"/>
+                <w:rtl/>
+              </w:rPr>
+              <w:t xml:space="preserve">وَ وُ وِ نَوۡ نُو</w:t>
+            </w:r>
+          </w:p>
+        </w:tc>
+      </w:tr>
+      <w:tr>
+        <w:tc>
+          <w:tcPr>
+            <w:tcW w:type="dxa" w:w="1900"/>
+          </w:tcPr>
+          <w:p>
+            <w:pPr>
+              <w:bidi/>
+              <w:jc w:val="center"/>
+            </w:pPr>
+            <w:r>
+              <w:rPr>
+                <w:rFonts w:ascii="KFGQPC HAFS Uthmanic Script" w:cs="KFGQPC HAFS Uthmanic Script" w:eastAsia="KFGQPC HAFS Uthmanic Script" w:hAnsi="KFGQPC HAFS Uthmanic Script"/>
+                <w:sz w:val="32"/>
+                <w:szCs w:val="32"/>
+                <w:rtl/>
+              </w:rPr>
+              <w:t xml:space="preserve">ي مقدمة</w:t>
+            </w:r>
+          </w:p>
+        </w:tc>
+        <w:tc>
+          <w:tcPr>
+            <w:tcW w:type="dxa" w:w="8060"/>
+          </w:tcPr>
+          <w:p>
+            <w:r>
+              <w:rPr>
+                <w:b w:val="false"/>
+                <w:bCs w:val="false"/>
+                <w:sz w:val="18"/>
+                <w:szCs w:val="18"/>
+              </w:rPr>
+              <w:t xml:space="preserve">This is the letter yaa. Do you remember the duck? When the duck climbs into the boat, you can see two bubbles under the boat. Yaa has two dots under it.</w:t>
+            </w:r>
+          </w:p>
+        </w:tc>
+        <w:tc>
+          <w:tcPr>
+            <w:tcW w:type="dxa" w:w="3000"/>
+          </w:tcPr>
+          <w:p>
+            <w:pPr>
+              <w:bidi/>
+              <w:jc w:val="center"/>
+            </w:pPr>
+          </w:p>
+        </w:tc>
+      </w:tr>
+      <w:tr>
+        <w:tc>
+          <w:tcPr>
+            <w:tcW w:type="dxa" w:w="1900"/>
+          </w:tcPr>
+          <w:p>
+            <w:pPr>
+              <w:bidi/>
+              <w:jc w:val="center"/>
+            </w:pPr>
+            <w:r>
+              <w:rPr>
+                <w:rFonts w:ascii="KFGQPC HAFS Uthmanic Script" w:cs="KFGQPC HAFS Uthmanic Script" w:eastAsia="KFGQPC HAFS Uthmanic Script" w:hAnsi="KFGQPC HAFS Uthmanic Script"/>
+                <w:sz w:val="32"/>
+                <w:szCs w:val="32"/>
+                <w:rtl/>
+              </w:rPr>
+              <w:t xml:space="preserve">ي حركات</w:t>
+            </w:r>
+          </w:p>
+        </w:tc>
+        <w:tc>
+          <w:tcPr>
+            <w:tcW w:type="dxa" w:w="8060"/>
+          </w:tcPr>
+          <w:p>
+            <w:r>
+              <w:rPr>
+                <w:b w:val="false"/>
+                <w:bCs w:val="false"/>
+                <w:sz w:val="18"/>
+                <w:szCs w:val="18"/>
+              </w:rPr>
+              <w:t xml:space="preserve">With a fatha it's يَ. With a damma it's يُ. With a kasra it's يِ. After نَ with a sukoon it's نَيۡ. And after نِ it stretches — نِي.</w:t>
+            </w:r>
+          </w:p>
+        </w:tc>
+        <w:tc>
+          <w:tcPr>
+            <w:tcW w:type="dxa" w:w="3000"/>
+          </w:tcPr>
+          <w:p>
+            <w:pPr>
+              <w:bidi/>
+              <w:jc w:val="center"/>
+            </w:pPr>
+            <w:r>
+              <w:rPr>
+                <w:rFonts w:ascii="KFGQPC HAFS Uthmanic Script" w:cs="KFGQPC HAFS Uthmanic Script" w:eastAsia="KFGQPC HAFS Uthmanic Script" w:hAnsi="KFGQPC HAFS Uthmanic Script"/>
+                <w:sz w:val="32"/>
+                <w:szCs w:val="32"/>
+                <w:rtl/>
+              </w:rPr>
+              <w:t xml:space="preserve">يَـ يُـ يِـ نَيۡ نِي</w:t>
+            </w:r>
+          </w:p>
+        </w:tc>
+      </w:tr>
+      <w:tr>
+        <w:tc>
+          <w:tcPr>
+            <w:tcW w:type="dxa" w:w="1900"/>
+          </w:tcPr>
+          <w:p>
+            <w:pPr>
+              <w:bidi/>
+              <w:jc w:val="center"/>
+            </w:pPr>
+            <w:r>
+              <w:rPr>
+                <w:rFonts w:ascii="KFGQPC HAFS Uthmanic Script" w:cs="KFGQPC HAFS Uthmanic Script" w:eastAsia="KFGQPC HAFS Uthmanic Script" w:hAnsi="KFGQPC HAFS Uthmanic Script"/>
+                <w:sz w:val="32"/>
+                <w:szCs w:val="32"/>
+                <w:rtl/>
+              </w:rPr>
+              <w:t xml:space="preserve">ى مقدمة</w:t>
+            </w:r>
+          </w:p>
+        </w:tc>
+        <w:tc>
+          <w:tcPr>
+            <w:tcW w:type="dxa" w:w="8060"/>
+          </w:tcPr>
+          <w:p>
+            <w:r>
+              <w:rPr>
+                <w:b w:val="false"/>
+                <w:bCs w:val="false"/>
+                <w:sz w:val="18"/>
+                <w:szCs w:val="18"/>
+              </w:rPr>
+              <w:t xml:space="preserve">This is the duck again — a yaa with no dots. It comes at the end of a word, like فِى. And sometimes it is really an alif in disguise, like مُوسَى.</w:t>
+            </w:r>
+          </w:p>
+        </w:tc>
+        <w:tc>
+          <w:tcPr>
+            <w:tcW w:type="dxa" w:w="3000"/>
+          </w:tcPr>
+          <w:p>
+            <w:pPr>
+              <w:bidi/>
+              <w:jc w:val="center"/>
+            </w:pPr>
+          </w:p>
+        </w:tc>
+      </w:tr>
+      <w:tr>
+        <w:tc>
+          <w:tcPr>
+            <w:tcW w:type="dxa" w:w="1900"/>
+          </w:tcPr>
+          <w:p>
+            <w:pPr>
+              <w:bidi/>
+              <w:jc w:val="center"/>
+            </w:pPr>
+            <w:r>
+              <w:rPr>
+                <w:rFonts w:ascii="KFGQPC HAFS Uthmanic Script" w:cs="KFGQPC HAFS Uthmanic Script" w:eastAsia="KFGQPC HAFS Uthmanic Script" w:hAnsi="KFGQPC HAFS Uthmanic Script"/>
+                <w:sz w:val="32"/>
+                <w:szCs w:val="32"/>
+                <w:rtl/>
+              </w:rPr>
+              <w:t xml:space="preserve">ى حركات</w:t>
+            </w:r>
+          </w:p>
+        </w:tc>
+        <w:tc>
+          <w:tcPr>
+            <w:tcW w:type="dxa" w:w="8060"/>
+          </w:tcPr>
+          <w:p>
+            <w:r>
+              <w:rPr>
+                <w:b w:val="false"/>
+                <w:bCs w:val="false"/>
+                <w:sz w:val="18"/>
+                <w:szCs w:val="18"/>
+              </w:rPr>
+              <w:t xml:space="preserve">Listen: فِى. مُوسَى.</w:t>
+            </w:r>
+          </w:p>
+        </w:tc>
+        <w:tc>
+          <w:tcPr>
+            <w:tcW w:type="dxa" w:w="3000"/>
+          </w:tcPr>
+          <w:p>
+            <w:pPr>
+              <w:bidi/>
+              <w:jc w:val="center"/>
+            </w:pPr>
+            <w:r>
+              <w:rPr>
+                <w:rFonts w:ascii="KFGQPC HAFS Uthmanic Script" w:cs="KFGQPC HAFS Uthmanic Script" w:eastAsia="KFGQPC HAFS Uthmanic Script" w:hAnsi="KFGQPC HAFS Uthmanic Script"/>
+                <w:sz w:val="32"/>
+                <w:szCs w:val="32"/>
+                <w:rtl/>
+              </w:rPr>
+              <w:t xml:space="preserve">فِى مُوسَىٰ</w:t>
+            </w:r>
+          </w:p>
+        </w:tc>
+      </w:tr>
+      <w:tr>
+        <w:tc>
+          <w:tcPr>
+            <w:tcW w:type="dxa" w:w="1900"/>
+          </w:tcPr>
+          <w:p>
+            <w:pPr>
+              <w:bidi/>
+              <w:jc w:val="center"/>
+            </w:pPr>
+            <w:r>
+              <w:rPr>
+                <w:rFonts w:ascii="KFGQPC HAFS Uthmanic Script" w:cs="KFGQPC HAFS Uthmanic Script" w:eastAsia="KFGQPC HAFS Uthmanic Script" w:hAnsi="KFGQPC HAFS Uthmanic Script"/>
+                <w:sz w:val="32"/>
+                <w:szCs w:val="32"/>
+                <w:rtl/>
+              </w:rPr>
+              <w:t xml:space="preserve">ا مقدمة</w:t>
+            </w:r>
+          </w:p>
+        </w:tc>
+        <w:tc>
+          <w:tcPr>
+            <w:tcW w:type="dxa" w:w="8060"/>
+          </w:tcPr>
+          <w:p>
+            <w:r>
+              <w:rPr>
+                <w:b w:val="false"/>
+                <w:bCs w:val="false"/>
+                <w:sz w:val="18"/>
+                <w:szCs w:val="18"/>
+              </w:rPr>
+              <w:t xml:space="preserve">This is the letter alif. It looks like a lighthouse — tall and straight. Alif has no dots, and no fatha, damma or kasra of its own. It makes the letter before it long.</w:t>
+            </w:r>
+          </w:p>
+        </w:tc>
+        <w:tc>
+          <w:tcPr>
+            <w:tcW w:type="dxa" w:w="3000"/>
+          </w:tcPr>
+          <w:p>
+            <w:pPr>
+              <w:bidi/>
+              <w:jc w:val="center"/>
+            </w:pPr>
+          </w:p>
+        </w:tc>
+      </w:tr>
+      <w:tr>
+        <w:tc>
+          <w:tcPr>
+            <w:tcW w:type="dxa" w:w="1900"/>
+          </w:tcPr>
+          <w:p>
+            <w:pPr>
+              <w:bidi/>
+              <w:jc w:val="center"/>
+            </w:pPr>
+            <w:r>
+              <w:rPr>
+                <w:rFonts w:ascii="KFGQPC HAFS Uthmanic Script" w:cs="KFGQPC HAFS Uthmanic Script" w:eastAsia="KFGQPC HAFS Uthmanic Script" w:hAnsi="KFGQPC HAFS Uthmanic Script"/>
+                <w:sz w:val="32"/>
+                <w:szCs w:val="32"/>
+                <w:rtl/>
+              </w:rPr>
+              <w:t xml:space="preserve">ا حركات</w:t>
+            </w:r>
+          </w:p>
+        </w:tc>
+        <w:tc>
+          <w:tcPr>
+            <w:tcW w:type="dxa" w:w="8060"/>
+          </w:tcPr>
+          <w:p>
+            <w:r>
+              <w:rPr>
+                <w:b w:val="false"/>
+                <w:bCs w:val="false"/>
+                <w:sz w:val="18"/>
+                <w:szCs w:val="18"/>
+              </w:rPr>
+              <w:t xml:space="preserve">After نَ it stretches — نَا.</w:t>
+            </w:r>
+          </w:p>
+        </w:tc>
+        <w:tc>
+          <w:tcPr>
+            <w:tcW w:type="dxa" w:w="3000"/>
+          </w:tcPr>
+          <w:p>
+            <w:pPr>
+              <w:bidi/>
+              <w:jc w:val="center"/>
+            </w:pPr>
+            <w:r>
+              <w:rPr>
+                <w:rFonts w:ascii="KFGQPC HAFS Uthmanic Script" w:cs="KFGQPC HAFS Uthmanic Script" w:eastAsia="KFGQPC HAFS Uthmanic Script" w:hAnsi="KFGQPC HAFS Uthmanic Script"/>
+                <w:sz w:val="32"/>
+                <w:szCs w:val="32"/>
+                <w:rtl/>
+              </w:rPr>
+              <w:t xml:space="preserve">نَا</w:t>
+            </w:r>
+          </w:p>
+        </w:tc>
+      </w:tr>
+      <w:tr>
+        <w:tc>
+          <w:tcPr>
+            <w:tcW w:type="dxa" w:w="1900"/>
+          </w:tcPr>
+          <w:p>
+            <w:pPr>
+              <w:bidi/>
+              <w:jc w:val="center"/>
+            </w:pPr>
+            <w:r>
+              <w:rPr>
+                <w:rFonts w:ascii="KFGQPC HAFS Uthmanic Script" w:cs="KFGQPC HAFS Uthmanic Script" w:eastAsia="KFGQPC HAFS Uthmanic Script" w:hAnsi="KFGQPC HAFS Uthmanic Script"/>
+                <w:sz w:val="32"/>
+                <w:szCs w:val="32"/>
+                <w:rtl/>
+              </w:rPr>
+              <w:t xml:space="preserve">لا مقدمة</w:t>
+            </w:r>
+          </w:p>
+        </w:tc>
+        <w:tc>
+          <w:tcPr>
+            <w:tcW w:type="dxa" w:w="8060"/>
+          </w:tcPr>
+          <w:p>
+            <w:r>
+              <w:rPr>
+                <w:b w:val="false"/>
+                <w:bCs w:val="false"/>
+                <w:sz w:val="18"/>
+                <w:szCs w:val="18"/>
+              </w:rPr>
+              <w:t xml:space="preserve">This is laam and alif holding hands. It looks like two oars crossed. Two letters, one shape.</w:t>
+            </w:r>
+          </w:p>
+        </w:tc>
+        <w:tc>
+          <w:tcPr>
+            <w:tcW w:type="dxa" w:w="3000"/>
+          </w:tcPr>
+          <w:p>
+            <w:pPr>
+              <w:bidi/>
+              <w:jc w:val="center"/>
+            </w:pPr>
+          </w:p>
+        </w:tc>
+      </w:tr>
+      <w:tr>
+        <w:tc>
+          <w:tcPr>
+            <w:tcW w:type="dxa" w:w="1900"/>
+          </w:tcPr>
+          <w:p>
+            <w:pPr>
+              <w:bidi/>
+              <w:jc w:val="center"/>
+            </w:pPr>
+            <w:r>
+              <w:rPr>
+                <w:rFonts w:ascii="KFGQPC HAFS Uthmanic Script" w:cs="KFGQPC HAFS Uthmanic Script" w:eastAsia="KFGQPC HAFS Uthmanic Script" w:hAnsi="KFGQPC HAFS Uthmanic Script"/>
+                <w:sz w:val="32"/>
+                <w:szCs w:val="32"/>
+                <w:rtl/>
+              </w:rPr>
+              <w:t xml:space="preserve">لا حركات</w:t>
+            </w:r>
+          </w:p>
+        </w:tc>
+        <w:tc>
+          <w:tcPr>
+            <w:tcW w:type="dxa" w:w="8060"/>
+          </w:tcPr>
+          <w:p>
+            <w:r>
+              <w:rPr>
+                <w:b w:val="false"/>
+                <w:bCs w:val="false"/>
+                <w:sz w:val="18"/>
+                <w:szCs w:val="18"/>
+              </w:rPr>
+              <w:t xml:space="preserve">We read it لَا. And in a word — وَلَا.</w:t>
+            </w:r>
+          </w:p>
+        </w:tc>
+        <w:tc>
+          <w:tcPr>
+            <w:tcW w:type="dxa" w:w="3000"/>
+          </w:tcPr>
+          <w:p>
+            <w:pPr>
+              <w:bidi/>
+              <w:jc w:val="center"/>
+            </w:pPr>
+            <w:r>
+              <w:rPr>
+                <w:rFonts w:ascii="KFGQPC HAFS Uthmanic Script" w:cs="KFGQPC HAFS Uthmanic Script" w:eastAsia="KFGQPC HAFS Uthmanic Script" w:hAnsi="KFGQPC HAFS Uthmanic Script"/>
+                <w:sz w:val="32"/>
+                <w:szCs w:val="32"/>
+                <w:rtl/>
+              </w:rPr>
+              <w:t xml:space="preserve">لَا وَلَا</w:t>
+            </w:r>
+          </w:p>
+        </w:tc>
+      </w:tr>
+      <w:tr>
+        <w:tc>
+          <w:tcPr>
+            <w:tcW w:type="dxa" w:w="1900"/>
+          </w:tcPr>
+          <w:p>
+            <w:pPr>
+              <w:bidi/>
+              <w:jc w:val="center"/>
+            </w:pPr>
+            <w:r>
+              <w:rPr>
+                <w:rFonts w:ascii="KFGQPC HAFS Uthmanic Script" w:cs="KFGQPC HAFS Uthmanic Script" w:eastAsia="KFGQPC HAFS Uthmanic Script" w:hAnsi="KFGQPC HAFS Uthmanic Script"/>
+                <w:sz w:val="32"/>
+                <w:szCs w:val="32"/>
+                <w:rtl/>
+              </w:rPr>
+              <w:t xml:space="preserve">ة مقدمة</w:t>
+            </w:r>
+          </w:p>
+        </w:tc>
+        <w:tc>
+          <w:tcPr>
+            <w:tcW w:type="dxa" w:w="8060"/>
+          </w:tcPr>
+          <w:p>
+            <w:r>
+              <w:rPr>
+                <w:b w:val="false"/>
+                <w:bCs w:val="false"/>
+                <w:sz w:val="18"/>
+                <w:szCs w:val="18"/>
+              </w:rPr>
+              <w:t xml:space="preserve">This is the taa marbuta — a taa wearing the haa's shape. It looks like the knot with two bubbles above it. Taa marbuta has two dots on top.</w:t>
+            </w:r>
+          </w:p>
+        </w:tc>
+        <w:tc>
+          <w:tcPr>
+            <w:tcW w:type="dxa" w:w="3000"/>
+          </w:tcPr>
+          <w:p>
+            <w:pPr>
+              <w:bidi/>
+              <w:jc w:val="center"/>
+            </w:pPr>
+          </w:p>
+        </w:tc>
+      </w:tr>
+      <w:tr>
+        <w:tc>
+          <w:tcPr>
+            <w:tcW w:type="dxa" w:w="1900"/>
+          </w:tcPr>
+          <w:p>
+            <w:pPr>
+              <w:bidi/>
+              <w:jc w:val="center"/>
+            </w:pPr>
+            <w:r>
+              <w:rPr>
+                <w:rFonts w:ascii="KFGQPC HAFS Uthmanic Script" w:cs="KFGQPC HAFS Uthmanic Script" w:eastAsia="KFGQPC HAFS Uthmanic Script" w:hAnsi="KFGQPC HAFS Uthmanic Script"/>
+                <w:sz w:val="32"/>
+                <w:szCs w:val="32"/>
+                <w:rtl/>
+              </w:rPr>
+              <w:t xml:space="preserve">ة حركات</w:t>
+            </w:r>
+          </w:p>
+        </w:tc>
+        <w:tc>
+          <w:tcPr>
+            <w:tcW w:type="dxa" w:w="8060"/>
+          </w:tcPr>
+          <w:p>
+            <w:r>
+              <w:rPr>
+                <w:b w:val="false"/>
+                <w:bCs w:val="false"/>
+                <w:sz w:val="18"/>
+                <w:szCs w:val="18"/>
+              </w:rPr>
+              <w:t xml:space="preserve">Listen: رَحۡمَةَ. نِعۡمَةَ.</w:t>
+            </w:r>
+          </w:p>
+        </w:tc>
+        <w:tc>
+          <w:tcPr>
+            <w:tcW w:type="dxa" w:w="3000"/>
+          </w:tcPr>
+          <w:p>
+            <w:pPr>
+              <w:bidi/>
+              <w:jc w:val="center"/>
+            </w:pPr>
+            <w:r>
+              <w:rPr>
+                <w:rFonts w:ascii="KFGQPC HAFS Uthmanic Script" w:cs="KFGQPC HAFS Uthmanic Script" w:eastAsia="KFGQPC HAFS Uthmanic Script" w:hAnsi="KFGQPC HAFS Uthmanic Script"/>
+                <w:sz w:val="32"/>
+                <w:szCs w:val="32"/>
+                <w:rtl/>
+              </w:rPr>
+              <w:t xml:space="preserve">رَحۡمَةَ نِعۡمَةَ</w:t>
             </w:r>
           </w:p>
         </w:tc>

</xml_diff>